<commit_message>
Excel: total row at bottom of Renk Kırılımı + Özet, integer tonnage
- 'Renk Kırılımı' sheet: bottom row 'TOPLAM' that sums Boş, Dolu,
  Kanban, Hurdaya Ayrılacak across all rows. Bold + light-blue fill
  to separate visually from data rows.
- 'Özet' sheet: same TOPLAM row, plus a tonnage total in the
  Tonaj column.
- Tonnage format changed from '#,##0.00' to '#,##0' everywhere
  (per-week Özet, all-weeks long sheet). Operators do not need
  decimal precision — '1234' reads cleaner than '1,234.50'.

Co-Authored-By: Claude Opus 4.7 (1M context) <noreply@anthropic.com>
</commit_message>
<xml_diff>
--- a/docs/Norm_Konteyner_Kullanici_Kilavuzu.docx
+++ b/docs/Norm_Konteyner_Kullanici_Kilavuzu.docx
@@ -4,113 +4,178 @@
   <w:body>
     <w:p>
       <w:pPr>
-        <w:spacing w:after="160"/>
+        <w:spacing w:after="0"/>
+      </w:pPr>
+    </w:p>
+    <w:p>
+      <w:pPr>
+        <w:spacing w:after="0"/>
+      </w:pPr>
+    </w:p>
+    <w:p>
+      <w:pPr>
+        <w:spacing w:after="0"/>
+      </w:pPr>
+    </w:p>
+    <w:p>
+      <w:pPr>
+        <w:spacing w:after="0"/>
+      </w:pPr>
+    </w:p>
+    <w:p>
+      <w:pPr>
+        <w:spacing w:after="120"/>
+        <w:jc w:val="center"/>
+      </w:pPr>
+      <w:r>
+        <w:rPr>
+          <w:b/>
+          <w:color w:val="475569"/>
+          <w:sz w:val="22"/>
+          <w:spacing w:val="100"/>
+        </w:rPr>
+        <w:t>NORM FASTENERS</w:t>
+      </w:r>
+    </w:p>
+    <w:p>
+      <w:pPr>
+        <w:spacing w:after="80"/>
         <w:jc w:val="center"/>
       </w:pPr>
       <w:r>
         <w:rPr>
           <w:b/>
           <w:color w:val="1F3A8A"/>
-          <w:sz w:val="48"/>
+          <w:sz w:val="56"/>
         </w:rPr>
-        <w:t>Norm Fasteners</w:t>
+        <w:t>Konteyner Sayım Portalı</w:t>
       </w:r>
     </w:p>
     <w:p>
       <w:pPr>
-        <w:spacing w:after="480"/>
+        <w:spacing w:after="720"/>
         <w:jc w:val="center"/>
       </w:pPr>
       <w:r>
         <w:rPr>
           <w:i/>
-          <w:color w:val="475569"/>
-          <w:sz w:val="22"/>
+          <w:color w:val="2563EB"/>
+          <w:sz w:val="32"/>
         </w:rPr>
-        <w:t>Konteyner Sayım Portalı — Kullanıcı Kılavuzu</w:t>
+        <w:t>Kullanıcı Kılavuzu</w:t>
+      </w:r>
+    </w:p>
+    <w:tbl>
+      <w:tblPr>
+        <w:tblW w:type="auto" w:w="0"/>
+        <w:tblLook w:firstColumn="1" w:firstRow="1" w:lastColumn="0" w:lastRow="0" w:noHBand="0" w:noVBand="1" w:val="04A0"/>
+      </w:tblPr>
+      <w:tblGrid>
+        <w:gridCol w:w="9518"/>
+      </w:tblGrid>
+      <w:tr>
+        <w:tc>
+          <w:tcPr>
+            <w:tcW w:type="dxa" w:w="7370"/>
+            <w:shd w:val="clear" w:color="auto" w:fill="F8FAFC"/>
+            <w:tcBorders>
+              <w:top w:val="single" w:sz="4" w:color="CBD5E1"/>
+              <w:left w:val="single" w:sz="4" w:color="CBD5E1"/>
+              <w:bottom w:val="single" w:sz="4" w:color="CBD5E1"/>
+              <w:right w:val="single" w:sz="4" w:color="CBD5E1"/>
+            </w:tcBorders>
+          </w:tcPr>
+          <w:p>
+            <w:pPr>
+              <w:spacing w:before="160" w:after="160" w:line="336" w:lineRule="auto"/>
+              <w:jc w:val="left"/>
+            </w:pPr>
+            <w:r>
+              <w:rPr>
+                <w:color w:val="0F172A"/>
+                <w:sz w:val="22"/>
+              </w:rPr>
+              <w:t>Bu kılavuz, haftalık konteyner sayım girişlerinizi portal üzerinden nasıl yapacağınızı adım adım anlatır. Sisteme erişim, form doldurma kuralları ve sık karşılaşılan sorunlar dahildir.</w:t>
+            </w:r>
+          </w:p>
+        </w:tc>
+      </w:tr>
+    </w:tbl>
+    <w:p>
+      <w:r>
+        <w:br w:type="page"/>
       </w:r>
     </w:p>
     <w:p>
       <w:pPr>
-        <w:spacing w:after="120"/>
+        <w:pStyle w:val="Heading1"/>
       </w:pPr>
       <w:r>
-        <w:rPr>
-          <w:color w:val="475569"/>
-          <w:sz w:val="20"/>
-        </w:rPr>
-        <w:t>Bu kılavuz, haftalık konteyner sayım girişlerinizi portal üzerinden nasıl yapacağınızı adım adım anlatır. Sistem hakkında temel bilgiler, form doldurma kuralları ve sık karşılaşılan sorunlar dahildir.</w:t>
+        <w:t>İçindekiler</w:t>
+      </w:r>
+    </w:p>
+    <w:p>
+      <w:r>
+        <w:fldChar w:fldCharType="begin"/>
+        <w:instrText xml:space="preserve">TOC \o "1-2" \h \z \u</w:instrText>
+        <w:fldChar w:fldCharType="separate"/>
+        <w:t>İçindekiler tablosunu güncellemek için F9 tuşuna basın.</w:t>
+        <w:fldChar w:fldCharType="end"/>
+      </w:r>
+    </w:p>
+    <w:p>
+      <w:r>
+        <w:br w:type="page"/>
       </w:r>
     </w:p>
     <w:p>
       <w:pPr>
-        <w:spacing w:after="240"/>
-        <w:jc w:val="center"/>
+        <w:pStyle w:val="Heading1"/>
       </w:pPr>
       <w:r>
-        <w:rPr>
-          <w:color w:val="CBD5E1"/>
-          <w:sz w:val="16"/>
-        </w:rPr>
-        <w:t>──────────────────────────────────────────────────────────────────────</w:t>
+        <w:t>1. Giriş ve Şifre</w:t>
       </w:r>
     </w:p>
     <w:p>
       <w:pPr>
-        <w:keepNext/>
-        <w:spacing w:before="400" w:after="160"/>
+        <w:spacing w:after="120" w:line="336" w:lineRule="auto"/>
+        <w:jc w:val="left"/>
       </w:pPr>
       <w:r>
         <w:rPr>
-          <w:b/>
-          <w:color w:val="1F3A8A"/>
-          <w:sz w:val="36"/>
+          <w:b w:val="0"/>
+          <w:i w:val="0"/>
+          <w:color w:val="0F172A"/>
+          <w:sz w:val="22"/>
         </w:rPr>
-        <w:t>1.  Giriş ve Şifre</w:t>
+        <w:t>Portala bilgisayardaki tarayıcıdan (Chrome, Edge vb.) erişiyorsunuz. Yönetici tarafından size iletilen kullanıcı adı ve şifre ile sisteme girersiniz.</w:t>
       </w:r>
     </w:p>
     <w:p>
       <w:pPr>
-        <w:spacing w:after="120"/>
+        <w:pStyle w:val="Heading2"/>
+      </w:pPr>
+      <w:r>
+        <w:t>Adım adım giriş</w:t>
+      </w:r>
+    </w:p>
+    <w:p>
+      <w:pPr>
+        <w:pStyle w:val="ListNumber"/>
+        <w:spacing w:after="60" w:line="312" w:lineRule="auto"/>
       </w:pPr>
       <w:r>
         <w:rPr>
           <w:color w:val="0F172A"/>
           <w:sz w:val="22"/>
         </w:rPr>
-        <w:t>Portala bilgisayarınızdaki tarayıcıdan (Chrome, Edge vb.) erişiyorsunuz.</w:t>
-      </w:r>
-    </w:p>
-    <w:p>
-      <w:pPr>
-        <w:spacing w:before="280" w:after="120"/>
-      </w:pPr>
-      <w:r>
-        <w:rPr>
-          <w:b/>
-          <w:color w:val="2563EB"/>
-          <w:sz w:val="28"/>
-        </w:rPr>
-        <w:t>Adım adım giriş</w:t>
+        <w:t>Tarayıcıyı açın, yöneticinin paylaştığı portal adresini girin.</w:t>
       </w:r>
     </w:p>
     <w:p>
       <w:pPr>
         <w:pStyle w:val="ListNumber"/>
-        <w:spacing w:after="60"/>
-      </w:pPr>
-      <w:r>
-        <w:rPr>
-          <w:color w:val="0F172A"/>
-          <w:sz w:val="22"/>
-        </w:rPr>
-        <w:t>Tarayıcıyı açın, yönetici tarafından size iletilen portal adresini girin.</w:t>
-      </w:r>
-    </w:p>
-    <w:p>
-      <w:pPr>
-        <w:pStyle w:val="ListNumber"/>
-        <w:spacing w:after="60"/>
+        <w:spacing w:after="60" w:line="312" w:lineRule="auto"/>
       </w:pPr>
       <w:r>
         <w:rPr>
@@ -123,7 +188,7 @@
     <w:p>
       <w:pPr>
         <w:pStyle w:val="ListNumber"/>
-        <w:spacing w:after="60"/>
+        <w:spacing w:after="60" w:line="312" w:lineRule="auto"/>
       </w:pPr>
       <w:r>
         <w:rPr>
@@ -133,94 +198,168 @@
         <w:t>“Giriş Yap” butonuna basın.</w:t>
       </w:r>
     </w:p>
+    <w:tbl>
+      <w:tblPr>
+        <w:tblW w:type="auto" w:w="0"/>
+        <w:tblLayout w:type="autofit"/>
+        <w:tblLook w:firstColumn="1" w:firstRow="1" w:lastColumn="0" w:lastRow="0" w:noHBand="0" w:noVBand="1" w:val="04A0"/>
+      </w:tblPr>
+      <w:tblGrid>
+        <w:gridCol w:w="9518"/>
+      </w:tblGrid>
+      <w:tr>
+        <w:tc>
+          <w:tcPr>
+            <w:tcW w:type="dxa" w:w="9518"/>
+            <w:shd w:val="clear" w:color="auto" w:fill="FCE4E4"/>
+            <w:tcBorders>
+              <w:top w:val="single" w:sz="2" w:color="FFFFFF"/>
+              <w:left w:val="single" w:sz="24" w:color="2563EB"/>
+              <w:bottom w:val="single" w:sz="2" w:color="FFFFFF"/>
+              <w:right w:val="single" w:sz="2" w:color="FFFFFF"/>
+            </w:tcBorders>
+          </w:tcPr>
+          <w:p>
+            <w:pPr>
+              <w:spacing w:before="40" w:after="40" w:line="312" w:lineRule="auto"/>
+            </w:pPr>
+            <w:r>
+              <w:rPr>
+                <w:b/>
+                <w:color w:val="DC2626"/>
+                <w:sz w:val="21"/>
+              </w:rPr>
+              <w:t xml:space="preserve">Yanlış şifre: </w:t>
+            </w:r>
+            <w:r>
+              <w:rPr>
+                <w:color w:val="0F172A"/>
+                <w:sz w:val="21"/>
+              </w:rPr>
+              <w:t>Sağ üst köşede uyarı görüntülenir. Bilgileri kontrol edip tekrar deneyin.</w:t>
+            </w:r>
+          </w:p>
+        </w:tc>
+      </w:tr>
+    </w:tbl>
+    <w:p>
+      <w:pPr>
+        <w:spacing w:after="120"/>
+      </w:pPr>
+    </w:p>
+    <w:tbl>
+      <w:tblPr>
+        <w:tblW w:type="auto" w:w="0"/>
+        <w:tblLayout w:type="autofit"/>
+        <w:tblLook w:firstColumn="1" w:firstRow="1" w:lastColumn="0" w:lastRow="0" w:noHBand="0" w:noVBand="1" w:val="04A0"/>
+      </w:tblPr>
+      <w:tblGrid>
+        <w:gridCol w:w="9518"/>
+      </w:tblGrid>
+      <w:tr>
+        <w:tc>
+          <w:tcPr>
+            <w:tcW w:type="dxa" w:w="9518"/>
+            <w:shd w:val="clear" w:color="auto" w:fill="E0EAF8"/>
+            <w:tcBorders>
+              <w:top w:val="single" w:sz="2" w:color="FFFFFF"/>
+              <w:left w:val="single" w:sz="24" w:color="2563EB"/>
+              <w:bottom w:val="single" w:sz="2" w:color="FFFFFF"/>
+              <w:right w:val="single" w:sz="2" w:color="FFFFFF"/>
+            </w:tcBorders>
+          </w:tcPr>
+          <w:p>
+            <w:pPr>
+              <w:spacing w:before="40" w:after="40" w:line="312" w:lineRule="auto"/>
+            </w:pPr>
+            <w:r>
+              <w:rPr>
+                <w:b/>
+                <w:color w:val="2563EB"/>
+                <w:sz w:val="21"/>
+              </w:rPr>
+              <w:t xml:space="preserve">Şifrenizi unuttunuz mu: </w:t>
+            </w:r>
+            <w:r>
+              <w:rPr>
+                <w:color w:val="0F172A"/>
+                <w:sz w:val="21"/>
+              </w:rPr>
+              <w:t>Yöneticinizle iletişime geçin; şifrenizi sıfırlatabilir.</w:t>
+            </w:r>
+          </w:p>
+        </w:tc>
+      </w:tr>
+    </w:tbl>
+    <w:p>
+      <w:pPr>
+        <w:spacing w:after="120"/>
+      </w:pPr>
+    </w:p>
+    <w:tbl>
+      <w:tblPr>
+        <w:tblW w:type="auto" w:w="0"/>
+        <w:tblLook w:firstColumn="1" w:firstRow="1" w:lastColumn="0" w:lastRow="0" w:noHBand="0" w:noVBand="1" w:val="04A0"/>
+      </w:tblPr>
+      <w:tblGrid>
+        <w:gridCol w:w="9518"/>
+      </w:tblGrid>
+      <w:tr>
+        <w:tc>
+          <w:tcPr>
+            <w:tcW w:type="dxa" w:w="9518"/>
+            <w:tcBorders>
+              <w:top w:val="nil"/>
+              <w:left w:val="nil"/>
+              <w:right w:val="nil"/>
+              <w:bottom w:val="single" w:sz="6" w:color="CBD5E1"/>
+            </w:tcBorders>
+          </w:tcPr>
+          <w:p/>
+        </w:tc>
+      </w:tr>
+    </w:tbl>
     <w:p>
       <w:pPr>
         <w:spacing w:after="160"/>
-        <w:ind w:left="288"/>
+      </w:pPr>
+    </w:p>
+    <w:p>
+      <w:pPr>
+        <w:pStyle w:val="Heading1"/>
       </w:pPr>
       <w:r>
-        <w:rPr>
-          <w:b/>
-          <w:color w:val="DC2626"/>
-          <w:sz w:val="22"/>
-        </w:rPr>
-        <w:t xml:space="preserve">  ▸  Yanlış şifre: </w:t>
-      </w:r>
-      <w:r>
-        <w:rPr>
-          <w:color w:val="0F172A"/>
-          <w:sz w:val="22"/>
-        </w:rPr>
-        <w:t>Sağ üst köşede kırmızı bir uyarı çıkar. Doğru bilgilerle tekrar deneyin.</w:t>
+        <w:t>2. Ana Sayfa</w:t>
       </w:r>
     </w:p>
     <w:p>
       <w:pPr>
-        <w:spacing w:after="160"/>
-        <w:ind w:left="288"/>
+        <w:spacing w:after="120" w:line="336" w:lineRule="auto"/>
+        <w:jc w:val="left"/>
       </w:pPr>
       <w:r>
         <w:rPr>
-          <w:b/>
-          <w:color w:val="475569"/>
-          <w:sz w:val="22"/>
-        </w:rPr>
-        <w:t xml:space="preserve">  ▸  Şifrenizi unuttuysanız: </w:t>
-      </w:r>
-      <w:r>
-        <w:rPr>
+          <w:b w:val="0"/>
+          <w:i w:val="0"/>
           <w:color w:val="0F172A"/>
           <w:sz w:val="22"/>
         </w:rPr>
-        <w:t>Yöneticinizle iletişime geçin, sıfırlatabilir.</w:t>
+        <w:t>Login sonrası ilk açılan sayfa. Üstte “Hoş geldin, [adınız]” yazısı, altında bu haftanın tarihi ve sayım giriş penceresinin durumu yer alır.</w:t>
       </w:r>
     </w:p>
     <w:p>
       <w:pPr>
-        <w:keepNext/>
-        <w:spacing w:before="400" w:after="160"/>
+        <w:pStyle w:val="Heading2"/>
       </w:pPr>
       <w:r>
-        <w:rPr>
-          <w:b/>
-          <w:color w:val="1F3A8A"/>
-          <w:sz w:val="36"/>
-        </w:rPr>
-        <w:t>2.  Ana Sayfa</w:t>
-      </w:r>
-    </w:p>
-    <w:p>
-      <w:pPr>
-        <w:spacing w:after="120"/>
-      </w:pPr>
-      <w:r>
-        <w:rPr>
-          <w:color w:val="0F172A"/>
-          <w:sz w:val="22"/>
-        </w:rPr>
-        <w:t>Login sonrası ilk açılan sayfa. Üst kısımda “Hoş geldin, [adınız]” yazısı, altında bu haftanın tarihi ve sayım giriş penceresinin durumu görünür.</w:t>
-      </w:r>
-    </w:p>
-    <w:p>
-      <w:pPr>
-        <w:spacing w:before="280" w:after="120"/>
-      </w:pPr>
-      <w:r>
-        <w:rPr>
-          <w:b/>
-          <w:color w:val="2563EB"/>
-          <w:sz w:val="28"/>
-        </w:rPr>
         <w:t>Pencere durumu</w:t>
       </w:r>
     </w:p>
     <w:p>
       <w:pPr>
         <w:pStyle w:val="ListBullet"/>
-        <w:spacing w:after="60"/>
-        <w:ind w:left="720"/>
+        <w:spacing w:after="60" w:line="312" w:lineRule="auto"/>
       </w:pPr>
-      <w:r/>
       <w:r>
         <w:rPr>
           <w:color w:val="0F172A"/>
@@ -232,10 +371,8 @@
     <w:p>
       <w:pPr>
         <w:pStyle w:val="ListBullet"/>
-        <w:spacing w:after="60"/>
-        <w:ind w:left="720"/>
+        <w:spacing w:after="60" w:line="312" w:lineRule="auto"/>
       </w:pPr>
-      <w:r/>
       <w:r>
         <w:rPr>
           <w:color w:val="0F172A"/>
@@ -244,74 +381,96 @@
         <w:t>Gri “Sayım Kapalı”: pencere açık değil. Açılma zamanı yine ekranda yazılı (örn. “Pazartesi 09:00 – 12:00 arasında açılır”).</w:t>
       </w:r>
     </w:p>
+    <w:tbl>
+      <w:tblPr>
+        <w:tblW w:type="auto" w:w="0"/>
+        <w:tblLayout w:type="autofit"/>
+        <w:tblLook w:firstColumn="1" w:firstRow="1" w:lastColumn="0" w:lastRow="0" w:noHBand="0" w:noVBand="1" w:val="04A0"/>
+      </w:tblPr>
+      <w:tblGrid>
+        <w:gridCol w:w="9518"/>
+      </w:tblGrid>
+      <w:tr>
+        <w:tc>
+          <w:tcPr>
+            <w:tcW w:type="dxa" w:w="9518"/>
+            <w:shd w:val="clear" w:color="auto" w:fill="E0EAF8"/>
+            <w:tcBorders>
+              <w:top w:val="single" w:sz="2" w:color="FFFFFF"/>
+              <w:left w:val="single" w:sz="24" w:color="2563EB"/>
+              <w:bottom w:val="single" w:sz="2" w:color="FFFFFF"/>
+              <w:right w:val="single" w:sz="2" w:color="FFFFFF"/>
+            </w:tcBorders>
+          </w:tcPr>
+          <w:p>
+            <w:pPr>
+              <w:spacing w:before="40" w:after="40" w:line="312" w:lineRule="auto"/>
+            </w:pPr>
+            <w:r>
+              <w:rPr>
+                <w:b/>
+                <w:color w:val="2563EB"/>
+                <w:sz w:val="21"/>
+              </w:rPr>
+              <w:t xml:space="preserve">Sayım penceresi: </w:t>
+            </w:r>
+            <w:r>
+              <w:rPr>
+                <w:color w:val="0F172A"/>
+                <w:sz w:val="21"/>
+              </w:rPr>
+              <w:t>Her hafta Pazartesi 09:00 – 12:00 arasında açıktır. Yönetici farklı bir saat ayarlamışsa, sistem ona göre çalışır.</w:t>
+            </w:r>
+          </w:p>
+        </w:tc>
+      </w:tr>
+    </w:tbl>
     <w:p>
       <w:pPr>
-        <w:spacing w:after="160"/>
-        <w:ind w:left="288"/>
+        <w:spacing w:after="120"/>
       </w:pPr>
-      <w:r>
-        <w:rPr>
-          <w:b/>
-          <w:color w:val="2563EB"/>
-          <w:sz w:val="22"/>
-        </w:rPr>
-        <w:t xml:space="preserve">  ▸  Pencere zamanı: </w:t>
-      </w:r>
-      <w:r>
-        <w:rPr>
-          <w:color w:val="0F172A"/>
-          <w:sz w:val="22"/>
-        </w:rPr>
-        <w:t>Her hafta Pazartesi 09:00 – 12:00 arası açıktır. Yöneticiyle paylaşılan farklı bir saat varsa, sistem ona göre çalışır.</w:t>
-      </w:r>
     </w:p>
     <w:p>
       <w:pPr>
-        <w:spacing w:before="280" w:after="120"/>
+        <w:pStyle w:val="Heading2"/>
       </w:pPr>
       <w:r>
-        <w:rPr>
-          <w:b/>
-          <w:color w:val="2563EB"/>
-          <w:sz w:val="28"/>
-        </w:rPr>
         <w:t>Hızlı erişim kartları</w:t>
       </w:r>
     </w:p>
     <w:p>
       <w:pPr>
-        <w:spacing w:after="120"/>
+        <w:spacing w:after="120" w:line="336" w:lineRule="auto"/>
+        <w:jc w:val="left"/>
+      </w:pPr>
+      <w:r>
+        <w:rPr>
+          <w:b w:val="0"/>
+          <w:i w:val="0"/>
+          <w:color w:val="0F172A"/>
+          <w:sz w:val="22"/>
+        </w:rPr>
+        <w:t>Ana sayfada doğrudan tıklanabilen iki kısayol vardır:</w:t>
+      </w:r>
+    </w:p>
+    <w:p>
+      <w:pPr>
+        <w:pStyle w:val="ListBullet"/>
+        <w:spacing w:after="60" w:line="312" w:lineRule="auto"/>
       </w:pPr>
       <w:r>
         <w:rPr>
           <w:color w:val="0F172A"/>
           <w:sz w:val="22"/>
         </w:rPr>
-        <w:t>Ana sayfada doğrudan tıklayabileceğiniz kısayollar var:</w:t>
+        <w:t>Sayım Girişi — haftalık sayım buradan yapılır.</w:t>
       </w:r>
     </w:p>
     <w:p>
       <w:pPr>
         <w:pStyle w:val="ListBullet"/>
-        <w:spacing w:after="60"/>
-        <w:ind w:left="720"/>
+        <w:spacing w:after="60" w:line="312" w:lineRule="auto"/>
       </w:pPr>
-      <w:r/>
-      <w:r>
-        <w:rPr>
-          <w:color w:val="0F172A"/>
-          <w:sz w:val="22"/>
-        </w:rPr>
-        <w:t>Sayım Girişi — haftalık sayımı buradan girersiniz.</w:t>
-      </w:r>
-    </w:p>
-    <w:p>
-      <w:pPr>
-        <w:pStyle w:val="ListBullet"/>
-        <w:spacing w:after="60"/>
-        <w:ind w:left="720"/>
-      </w:pPr>
-      <w:r/>
       <w:r>
         <w:rPr>
           <w:color w:val="0F172A"/>
@@ -320,318 +479,845 @@
         <w:t>Haftalık Durum — bu hafta hangi bölümler girdi, hangileri eksik?</w:t>
       </w:r>
     </w:p>
+    <w:tbl>
+      <w:tblPr>
+        <w:tblW w:type="auto" w:w="0"/>
+        <w:tblLook w:firstColumn="1" w:firstRow="1" w:lastColumn="0" w:lastRow="0" w:noHBand="0" w:noVBand="1" w:val="04A0"/>
+      </w:tblPr>
+      <w:tblGrid>
+        <w:gridCol w:w="9518"/>
+      </w:tblGrid>
+      <w:tr>
+        <w:tc>
+          <w:tcPr>
+            <w:tcW w:type="dxa" w:w="9518"/>
+            <w:tcBorders>
+              <w:top w:val="nil"/>
+              <w:left w:val="nil"/>
+              <w:right w:val="nil"/>
+              <w:bottom w:val="single" w:sz="6" w:color="CBD5E1"/>
+            </w:tcBorders>
+          </w:tcPr>
+          <w:p/>
+        </w:tc>
+      </w:tr>
+    </w:tbl>
     <w:p>
       <w:pPr>
-        <w:keepNext/>
-        <w:spacing w:before="400" w:after="160"/>
+        <w:spacing w:after="160"/>
+      </w:pPr>
+    </w:p>
+    <w:p>
+      <w:pPr>
+        <w:pStyle w:val="Heading1"/>
       </w:pPr>
       <w:r>
-        <w:rPr>
-          <w:b/>
-          <w:color w:val="1F3A8A"/>
-          <w:sz w:val="36"/>
-        </w:rPr>
-        <w:t>3.  Sayım Girişi (En Önemli Bölüm)</w:t>
+        <w:t>3. Sayım Girişi</w:t>
       </w:r>
     </w:p>
     <w:p>
       <w:pPr>
-        <w:spacing w:after="120"/>
+        <w:spacing w:after="120" w:line="336" w:lineRule="auto"/>
+        <w:jc w:val="left"/>
+      </w:pPr>
+      <w:r>
+        <w:rPr>
+          <w:b w:val="0"/>
+          <w:i w:val="0"/>
+          <w:color w:val="0F172A"/>
+          <w:sz w:val="22"/>
+        </w:rPr>
+        <w:t>Sol menüden “Sayım Girişi” seçeneğine tıklayın. Form yüklenir. Pencere kapalıyken form pasif olur, yalnızca pencere açıkken doldurulabilir.</w:t>
+      </w:r>
+    </w:p>
+    <w:p>
+      <w:pPr>
+        <w:pStyle w:val="Heading2"/>
+      </w:pPr>
+      <w:r>
+        <w:t>Hafta ve bölüm seçimi</w:t>
+      </w:r>
+    </w:p>
+    <w:p>
+      <w:pPr>
+        <w:pStyle w:val="ListBullet"/>
+        <w:spacing w:after="60" w:line="312" w:lineRule="auto"/>
       </w:pPr>
       <w:r>
         <w:rPr>
           <w:color w:val="0F172A"/>
           <w:sz w:val="22"/>
         </w:rPr>
-        <w:t>Sol menüden “Sayım Girişi”ne tıklayın. Form yüklenir. Pencere kapalıyken form pasif olur, yalnızca pencere açıkken doldurulabilir.</w:t>
-      </w:r>
-    </w:p>
-    <w:p>
-      <w:pPr>
-        <w:spacing w:before="280" w:after="120"/>
-      </w:pPr>
-      <w:r>
-        <w:rPr>
-          <w:b/>
-          <w:color w:val="2563EB"/>
-          <w:sz w:val="28"/>
-        </w:rPr>
-        <w:t>Üst kısım — Hafta ve Bölüm</w:t>
+        <w:t>Hafta otomatik gelir, değiştirilemez.</w:t>
       </w:r>
     </w:p>
     <w:p>
       <w:pPr>
         <w:pStyle w:val="ListBullet"/>
-        <w:spacing w:after="60"/>
-        <w:ind w:left="720"/>
-      </w:pPr>
-      <w:r/>
-      <w:r>
-        <w:rPr>
-          <w:color w:val="0F172A"/>
-          <w:sz w:val="22"/>
-        </w:rPr>
-        <w:t>Hafta otomatik gelir, değiştiremezsiniz. Sistem o anki haftayı seçer.</w:t>
-      </w:r>
-    </w:p>
-    <w:p>
-      <w:pPr>
-        <w:pStyle w:val="ListBullet"/>
-        <w:spacing w:after="60"/>
-        <w:ind w:left="720"/>
-      </w:pPr>
-      <w:r/>
-      <w:r>
-        <w:rPr>
-          <w:color w:val="0F172A"/>
-          <w:sz w:val="22"/>
-        </w:rPr>
-        <w:t>“Bölüm” açılır listesinden kendi sorumlu olduğunuz bölümü seçin.</w:t>
-      </w:r>
-    </w:p>
-    <w:p>
-      <w:pPr>
-        <w:pStyle w:val="ListBullet"/>
-        <w:spacing w:after="60"/>
-        <w:ind w:left="720"/>
-      </w:pPr>
-      <w:r/>
-      <w:r>
-        <w:rPr>
-          <w:color w:val="0F172A"/>
-          <w:sz w:val="22"/>
-        </w:rPr>
-        <w:t>Birden fazla bölümden sorumluysanız hepsi listede çıkar; her birine ayrı ayrı sayım girersiniz.</w:t>
-      </w:r>
-    </w:p>
-    <w:p>
-      <w:pPr>
-        <w:spacing w:before="280" w:after="120"/>
-      </w:pPr>
-      <w:r>
-        <w:rPr>
-          <w:b/>
-          <w:color w:val="2563EB"/>
-          <w:sz w:val="28"/>
-        </w:rPr>
-        <w:t>Tarih ve saat</w:t>
-      </w:r>
-    </w:p>
-    <w:p>
-      <w:pPr>
-        <w:spacing w:after="120"/>
+        <w:spacing w:after="60" w:line="312" w:lineRule="auto"/>
       </w:pPr>
       <w:r>
         <w:rPr>
           <w:color w:val="0F172A"/>
           <w:sz w:val="22"/>
         </w:rPr>
-        <w:t>Otomatik olarak işlenir, manuel girilmez. Sistem kayıt anının zamanını damgalar.</w:t>
+        <w:t>“Bölüm” açılır listesinden kendi sorumlu olduğunuz bölümü seçin. Birden fazla bölümden sorumluysanız her biri için ayrı ayrı sayım girersiniz.</w:t>
       </w:r>
     </w:p>
     <w:p>
       <w:pPr>
-        <w:spacing w:before="280" w:after="120"/>
+        <w:pStyle w:val="Heading2"/>
+      </w:pPr>
+      <w:r>
+        <w:t>Tarih ve saat</w:t>
+      </w:r>
+    </w:p>
+    <w:p>
+      <w:pPr>
+        <w:spacing w:after="120" w:line="336" w:lineRule="auto"/>
+        <w:jc w:val="left"/>
+      </w:pPr>
+      <w:r>
+        <w:rPr>
+          <w:b w:val="0"/>
+          <w:i w:val="0"/>
+          <w:color w:val="0F172A"/>
+          <w:sz w:val="22"/>
+        </w:rPr>
+        <w:t>Otomatik damgalanır, manuel girilmez. Sistem kayıt anının zamanını yazar.</w:t>
+      </w:r>
+    </w:p>
+    <w:p>
+      <w:pPr>
+        <w:pStyle w:val="Heading2"/>
+      </w:pPr>
+      <w:r>
+        <w:t>Yarı mamül tonajı (toplam)</w:t>
+      </w:r>
+    </w:p>
+    <w:tbl>
+      <w:tblPr>
+        <w:tblW w:type="auto" w:w="0"/>
+        <w:tblLayout w:type="autofit"/>
+        <w:tblLook w:firstColumn="1" w:firstRow="1" w:lastColumn="0" w:lastRow="0" w:noHBand="0" w:noVBand="1" w:val="04A0"/>
+      </w:tblPr>
+      <w:tblGrid>
+        <w:gridCol w:w="9518"/>
+      </w:tblGrid>
+      <w:tr>
+        <w:tc>
+          <w:tcPr>
+            <w:tcW w:type="dxa" w:w="9518"/>
+            <w:shd w:val="clear" w:color="auto" w:fill="FCE4E4"/>
+            <w:tcBorders>
+              <w:top w:val="single" w:sz="2" w:color="FFFFFF"/>
+              <w:left w:val="single" w:sz="24" w:color="2563EB"/>
+              <w:bottom w:val="single" w:sz="2" w:color="FFFFFF"/>
+              <w:right w:val="single" w:sz="2" w:color="FFFFFF"/>
+            </w:tcBorders>
+          </w:tcPr>
+          <w:p>
+            <w:pPr>
+              <w:spacing w:before="40" w:after="40" w:line="312" w:lineRule="auto"/>
+            </w:pPr>
+            <w:r>
+              <w:rPr>
+                <w:b/>
+                <w:color w:val="DC2626"/>
+                <w:sz w:val="21"/>
+              </w:rPr>
+              <w:t xml:space="preserve">Zorunlu alan: </w:t>
+            </w:r>
+            <w:r>
+              <w:rPr>
+                <w:color w:val="0F172A"/>
+                <w:sz w:val="21"/>
+              </w:rPr>
+              <w:t>Bu alan boş bırakılırsa kayıt yapılamaz. Sistem uyarı verir, kutu kırmızı yanar.</w:t>
+            </w:r>
+          </w:p>
+        </w:tc>
+      </w:tr>
+    </w:tbl>
+    <w:p>
+      <w:pPr>
+        <w:spacing w:after="120"/>
+      </w:pPr>
+    </w:p>
+    <w:p>
+      <w:pPr>
+        <w:spacing w:after="120" w:line="336" w:lineRule="auto"/>
+        <w:jc w:val="left"/>
+      </w:pPr>
+      <w:r>
+        <w:rPr>
+          <w:b w:val="0"/>
+          <w:i w:val="0"/>
+          <w:color w:val="0F172A"/>
+          <w:sz w:val="22"/>
+        </w:rPr>
+        <w:t>Bölümünüzde o haftaki yarı mamül tonajını yazın. Ondalık değer girilebilir (örn. 1234 ya da 12.5).</w:t>
+      </w:r>
+    </w:p>
+    <w:p>
+      <w:pPr>
+        <w:pStyle w:val="Heading2"/>
+      </w:pPr>
+      <w:r>
+        <w:t>Renk × Sayım tablosu</w:t>
+      </w:r>
+    </w:p>
+    <w:p>
+      <w:pPr>
+        <w:spacing w:after="120" w:line="336" w:lineRule="auto"/>
+        <w:jc w:val="left"/>
+      </w:pPr>
+      <w:r>
+        <w:rPr>
+          <w:b w:val="0"/>
+          <w:i w:val="0"/>
+          <w:color w:val="0F172A"/>
+          <w:sz w:val="22"/>
+        </w:rPr>
+        <w:t>Her renk için 4 değer girilir:</w:t>
+      </w:r>
+    </w:p>
+    <w:tbl>
+      <w:tblPr>
+        <w:tblW w:type="auto" w:w="0"/>
+        <w:tblLayout w:type="fixed"/>
+        <w:tblLook w:firstColumn="1" w:firstRow="1" w:lastColumn="0" w:lastRow="0" w:noHBand="0" w:noVBand="1" w:val="04A0"/>
+      </w:tblPr>
+      <w:tblGrid>
+        <w:gridCol w:w="2551"/>
+        <w:gridCol w:w="6520"/>
+      </w:tblGrid>
+      <w:tr>
+        <w:tc>
+          <w:tcPr>
+            <w:tcW w:type="dxa" w:w="2551"/>
+            <w:shd w:val="clear" w:color="auto" w:fill="1F3A8A"/>
+          </w:tcPr>
+          <w:p>
+            <w:pPr>
+              <w:spacing w:before="80" w:after="80"/>
+            </w:pPr>
+            <w:r>
+              <w:rPr>
+                <w:b/>
+                <w:color w:val="FFFFFF"/>
+                <w:sz w:val="22"/>
+              </w:rPr>
+              <w:t>Sayım Tipi</w:t>
+            </w:r>
+          </w:p>
+        </w:tc>
+        <w:tc>
+          <w:tcPr>
+            <w:tcW w:type="dxa" w:w="6520"/>
+            <w:shd w:val="clear" w:color="auto" w:fill="1F3A8A"/>
+          </w:tcPr>
+          <w:p>
+            <w:pPr>
+              <w:spacing w:before="80" w:after="80"/>
+            </w:pPr>
+            <w:r>
+              <w:rPr>
+                <w:b/>
+                <w:color w:val="FFFFFF"/>
+                <w:sz w:val="22"/>
+              </w:rPr>
+              <w:t>Açıklama</w:t>
+            </w:r>
+          </w:p>
+        </w:tc>
+      </w:tr>
+      <w:tr>
+        <w:tc>
+          <w:tcPr>
+            <w:tcW w:type="dxa" w:w="2551"/>
+            <w:shd w:val="clear" w:color="auto" w:fill="FFFFFF"/>
+            <w:tcBorders>
+              <w:top w:val="single" w:sz="4" w:color="E2E8F0"/>
+              <w:left w:val="single" w:sz="4" w:color="E2E8F0"/>
+              <w:bottom w:val="single" w:sz="4" w:color="E2E8F0"/>
+              <w:right w:val="single" w:sz="4" w:color="E2E8F0"/>
+            </w:tcBorders>
+            <w:vAlign w:val="top"/>
+          </w:tcPr>
+          <w:p>
+            <w:pPr>
+              <w:spacing w:before="80" w:after="80"/>
+            </w:pPr>
+            <w:r>
+              <w:rPr>
+                <w:b/>
+                <w:color w:val="1F3A8A"/>
+                <w:sz w:val="22"/>
+              </w:rPr>
+              <w:t>Boş</w:t>
+            </w:r>
+          </w:p>
+        </w:tc>
+        <w:tc>
+          <w:tcPr>
+            <w:tcW w:type="dxa" w:w="6520"/>
+            <w:shd w:val="clear" w:color="auto" w:fill="FFFFFF"/>
+            <w:tcBorders>
+              <w:top w:val="single" w:sz="4" w:color="E2E8F0"/>
+              <w:left w:val="single" w:sz="4" w:color="E2E8F0"/>
+              <w:bottom w:val="single" w:sz="4" w:color="E2E8F0"/>
+              <w:right w:val="single" w:sz="4" w:color="E2E8F0"/>
+            </w:tcBorders>
+            <w:vAlign w:val="top"/>
+          </w:tcPr>
+          <w:p>
+            <w:pPr>
+              <w:spacing w:before="80" w:after="80"/>
+            </w:pPr>
+            <w:r>
+              <w:rPr>
+                <w:color w:val="0F172A"/>
+                <w:sz w:val="22"/>
+              </w:rPr>
+              <w:t>O renkten kaç adet boş konteyner var?</w:t>
+            </w:r>
+          </w:p>
+        </w:tc>
+      </w:tr>
+      <w:tr>
+        <w:tc>
+          <w:tcPr>
+            <w:tcW w:type="dxa" w:w="2551"/>
+            <w:shd w:val="clear" w:color="auto" w:fill="F8FAFC"/>
+            <w:tcBorders>
+              <w:top w:val="single" w:sz="4" w:color="E2E8F0"/>
+              <w:left w:val="single" w:sz="4" w:color="E2E8F0"/>
+              <w:bottom w:val="single" w:sz="4" w:color="E2E8F0"/>
+              <w:right w:val="single" w:sz="4" w:color="E2E8F0"/>
+            </w:tcBorders>
+            <w:vAlign w:val="top"/>
+          </w:tcPr>
+          <w:p>
+            <w:pPr>
+              <w:spacing w:before="80" w:after="80"/>
+            </w:pPr>
+            <w:r>
+              <w:rPr>
+                <w:b/>
+                <w:color w:val="1F3A8A"/>
+                <w:sz w:val="22"/>
+              </w:rPr>
+              <w:t>Dolu (toplam)</w:t>
+            </w:r>
+          </w:p>
+        </w:tc>
+        <w:tc>
+          <w:tcPr>
+            <w:tcW w:type="dxa" w:w="6520"/>
+            <w:shd w:val="clear" w:color="auto" w:fill="F8FAFC"/>
+            <w:tcBorders>
+              <w:top w:val="single" w:sz="4" w:color="E2E8F0"/>
+              <w:left w:val="single" w:sz="4" w:color="E2E8F0"/>
+              <w:bottom w:val="single" w:sz="4" w:color="E2E8F0"/>
+              <w:right w:val="single" w:sz="4" w:color="E2E8F0"/>
+            </w:tcBorders>
+            <w:vAlign w:val="top"/>
+          </w:tcPr>
+          <w:p>
+            <w:pPr>
+              <w:spacing w:before="80" w:after="80"/>
+            </w:pPr>
+            <w:r>
+              <w:rPr>
+                <w:color w:val="0F172A"/>
+                <w:sz w:val="22"/>
+              </w:rPr>
+              <w:t>O renkten kaç adet dolu konteyner var?</w:t>
+            </w:r>
+          </w:p>
+        </w:tc>
+      </w:tr>
+      <w:tr>
+        <w:tc>
+          <w:tcPr>
+            <w:tcW w:type="dxa" w:w="2551"/>
+            <w:shd w:val="clear" w:color="auto" w:fill="FFFFFF"/>
+            <w:tcBorders>
+              <w:top w:val="single" w:sz="4" w:color="E2E8F0"/>
+              <w:left w:val="single" w:sz="4" w:color="E2E8F0"/>
+              <w:bottom w:val="single" w:sz="4" w:color="E2E8F0"/>
+              <w:right w:val="single" w:sz="4" w:color="E2E8F0"/>
+            </w:tcBorders>
+            <w:vAlign w:val="top"/>
+          </w:tcPr>
+          <w:p>
+            <w:pPr>
+              <w:spacing w:before="80" w:after="80"/>
+            </w:pPr>
+            <w:r>
+              <w:rPr>
+                <w:b/>
+                <w:color w:val="1F3A8A"/>
+                <w:sz w:val="22"/>
+              </w:rPr>
+              <w:t>Kanban</w:t>
+            </w:r>
+          </w:p>
+        </w:tc>
+        <w:tc>
+          <w:tcPr>
+            <w:tcW w:type="dxa" w:w="6520"/>
+            <w:shd w:val="clear" w:color="auto" w:fill="FFFFFF"/>
+            <w:tcBorders>
+              <w:top w:val="single" w:sz="4" w:color="E2E8F0"/>
+              <w:left w:val="single" w:sz="4" w:color="E2E8F0"/>
+              <w:bottom w:val="single" w:sz="4" w:color="E2E8F0"/>
+              <w:right w:val="single" w:sz="4" w:color="E2E8F0"/>
+            </w:tcBorders>
+            <w:vAlign w:val="top"/>
+          </w:tcPr>
+          <w:p>
+            <w:pPr>
+              <w:spacing w:before="80" w:after="80"/>
+            </w:pPr>
+            <w:r>
+              <w:rPr>
+                <w:color w:val="0F172A"/>
+                <w:sz w:val="22"/>
+              </w:rPr>
+              <w:t>Dolu konteynerlerin kaç tanesi kanban olarak kullanılıyor? Kanban dolu'nun ALT KÜMESİDİR — dolu sayısından büyük olamaz.</w:t>
+            </w:r>
+          </w:p>
+        </w:tc>
+      </w:tr>
+      <w:tr>
+        <w:tc>
+          <w:tcPr>
+            <w:tcW w:type="dxa" w:w="2551"/>
+            <w:shd w:val="clear" w:color="auto" w:fill="F8FAFC"/>
+            <w:tcBorders>
+              <w:top w:val="single" w:sz="4" w:color="E2E8F0"/>
+              <w:left w:val="single" w:sz="4" w:color="E2E8F0"/>
+              <w:bottom w:val="single" w:sz="4" w:color="E2E8F0"/>
+              <w:right w:val="single" w:sz="4" w:color="E2E8F0"/>
+            </w:tcBorders>
+            <w:vAlign w:val="top"/>
+          </w:tcPr>
+          <w:p>
+            <w:pPr>
+              <w:spacing w:before="80" w:after="80"/>
+            </w:pPr>
+            <w:r>
+              <w:rPr>
+                <w:b/>
+                <w:color w:val="1F3A8A"/>
+                <w:sz w:val="22"/>
+              </w:rPr>
+              <w:t>Hurdaya Ayrılacak</w:t>
+            </w:r>
+          </w:p>
+        </w:tc>
+        <w:tc>
+          <w:tcPr>
+            <w:tcW w:type="dxa" w:w="6520"/>
+            <w:shd w:val="clear" w:color="auto" w:fill="F8FAFC"/>
+            <w:tcBorders>
+              <w:top w:val="single" w:sz="4" w:color="E2E8F0"/>
+              <w:left w:val="single" w:sz="4" w:color="E2E8F0"/>
+              <w:bottom w:val="single" w:sz="4" w:color="E2E8F0"/>
+              <w:right w:val="single" w:sz="4" w:color="E2E8F0"/>
+            </w:tcBorders>
+            <w:vAlign w:val="top"/>
+          </w:tcPr>
+          <w:p>
+            <w:pPr>
+              <w:spacing w:before="80" w:after="80"/>
+            </w:pPr>
+            <w:r>
+              <w:rPr>
+                <w:color w:val="0F172A"/>
+                <w:sz w:val="22"/>
+              </w:rPr>
+              <w:t>Artık kullanılmayacak konteynerler (ayağı kırık, çatlak vb.). Boş ve dolu sayılarına dahil değildir, ayrıca sayılır.</w:t>
+            </w:r>
+          </w:p>
+        </w:tc>
+      </w:tr>
+    </w:tbl>
+    <w:p>
+      <w:pPr>
+        <w:spacing w:after="120"/>
+      </w:pPr>
+    </w:p>
+    <w:p>
+      <w:pPr>
+        <w:spacing w:after="120" w:line="336" w:lineRule="auto"/>
+        <w:jc w:val="left"/>
       </w:pPr>
       <w:r>
         <w:rPr>
           <w:b/>
-          <w:color w:val="2563EB"/>
-          <w:sz w:val="28"/>
+          <w:i w:val="0"/>
+          <w:color w:val="0F172A"/>
+          <w:sz w:val="22"/>
         </w:rPr>
-        <w:t>Yarı mamül tonajı (toplam)</w:t>
+        <w:t>Örnek — Mavi renk için doğru girilmiş bir sayım:</w:t>
+      </w:r>
+    </w:p>
+    <w:tbl>
+      <w:tblPr>
+        <w:tblW w:type="auto" w:w="0"/>
+        <w:tblLayout w:type="fixed"/>
+        <w:tblLook w:firstColumn="1" w:firstRow="1" w:lastColumn="0" w:lastRow="0" w:noHBand="0" w:noVBand="1" w:val="04A0"/>
+      </w:tblPr>
+      <w:tblGrid>
+        <w:gridCol w:w="2268"/>
+        <w:gridCol w:w="2268"/>
+        <w:gridCol w:w="2268"/>
+        <w:gridCol w:w="2268"/>
+      </w:tblGrid>
+      <w:tr>
+        <w:tc>
+          <w:tcPr>
+            <w:tcW w:type="dxa" w:w="2268"/>
+            <w:shd w:val="clear" w:color="auto" w:fill="EEF4FB"/>
+            <w:tcBorders>
+              <w:top w:val="single" w:sz="4" w:color="C6D4E5"/>
+              <w:left w:val="single" w:sz="4" w:color="C6D4E5"/>
+              <w:bottom w:val="single" w:sz="4" w:color="C6D4E5"/>
+              <w:right w:val="single" w:sz="4" w:color="C6D4E5"/>
+            </w:tcBorders>
+          </w:tcPr>
+          <w:p>
+            <w:pPr>
+              <w:spacing w:before="80" w:after="80"/>
+              <w:jc w:val="center"/>
+            </w:pPr>
+            <w:r>
+              <w:rPr>
+                <w:b/>
+                <w:color w:val="475569"/>
+                <w:sz w:val="20"/>
+              </w:rPr>
+              <w:t>Boş</w:t>
+            </w:r>
+          </w:p>
+        </w:tc>
+        <w:tc>
+          <w:tcPr>
+            <w:tcW w:type="dxa" w:w="2268"/>
+            <w:shd w:val="clear" w:color="auto" w:fill="EEF4FB"/>
+            <w:tcBorders>
+              <w:top w:val="single" w:sz="4" w:color="C6D4E5"/>
+              <w:left w:val="single" w:sz="4" w:color="C6D4E5"/>
+              <w:bottom w:val="single" w:sz="4" w:color="C6D4E5"/>
+              <w:right w:val="single" w:sz="4" w:color="C6D4E5"/>
+            </w:tcBorders>
+          </w:tcPr>
+          <w:p>
+            <w:pPr>
+              <w:spacing w:before="80" w:after="80"/>
+              <w:jc w:val="center"/>
+            </w:pPr>
+            <w:r>
+              <w:rPr>
+                <w:b/>
+                <w:color w:val="475569"/>
+                <w:sz w:val="20"/>
+              </w:rPr>
+              <w:t>Dolu (toplam)</w:t>
+            </w:r>
+          </w:p>
+        </w:tc>
+        <w:tc>
+          <w:tcPr>
+            <w:tcW w:type="dxa" w:w="2268"/>
+            <w:shd w:val="clear" w:color="auto" w:fill="EEF4FB"/>
+            <w:tcBorders>
+              <w:top w:val="single" w:sz="4" w:color="C6D4E5"/>
+              <w:left w:val="single" w:sz="4" w:color="C6D4E5"/>
+              <w:bottom w:val="single" w:sz="4" w:color="C6D4E5"/>
+              <w:right w:val="single" w:sz="4" w:color="C6D4E5"/>
+            </w:tcBorders>
+          </w:tcPr>
+          <w:p>
+            <w:pPr>
+              <w:spacing w:before="80" w:after="80"/>
+              <w:jc w:val="center"/>
+            </w:pPr>
+            <w:r>
+              <w:rPr>
+                <w:b/>
+                <w:color w:val="475569"/>
+                <w:sz w:val="20"/>
+              </w:rPr>
+              <w:t>Kanban</w:t>
+            </w:r>
+          </w:p>
+        </w:tc>
+        <w:tc>
+          <w:tcPr>
+            <w:tcW w:type="dxa" w:w="2268"/>
+            <w:shd w:val="clear" w:color="auto" w:fill="EEF4FB"/>
+            <w:tcBorders>
+              <w:top w:val="single" w:sz="4" w:color="C6D4E5"/>
+              <w:left w:val="single" w:sz="4" w:color="C6D4E5"/>
+              <w:bottom w:val="single" w:sz="4" w:color="C6D4E5"/>
+              <w:right w:val="single" w:sz="4" w:color="C6D4E5"/>
+            </w:tcBorders>
+          </w:tcPr>
+          <w:p>
+            <w:pPr>
+              <w:spacing w:before="80" w:after="80"/>
+              <w:jc w:val="center"/>
+            </w:pPr>
+            <w:r>
+              <w:rPr>
+                <w:b/>
+                <w:color w:val="475569"/>
+                <w:sz w:val="20"/>
+              </w:rPr>
+              <w:t>Hurdaya Ayrılacak</w:t>
+            </w:r>
+          </w:p>
+        </w:tc>
+      </w:tr>
+      <w:tr>
+        <w:tc>
+          <w:tcPr>
+            <w:tcW w:type="dxa" w:w="2268"/>
+            <w:shd w:val="clear" w:color="auto" w:fill="FFFFFF"/>
+            <w:tcBorders>
+              <w:top w:val="single" w:sz="4" w:color="E2E8F0"/>
+              <w:left w:val="single" w:sz="4" w:color="E2E8F0"/>
+              <w:bottom w:val="single" w:sz="4" w:color="E2E8F0"/>
+              <w:right w:val="single" w:sz="4" w:color="E2E8F0"/>
+            </w:tcBorders>
+          </w:tcPr>
+          <w:p>
+            <w:pPr>
+              <w:spacing w:before="120" w:after="120"/>
+              <w:jc w:val="center"/>
+            </w:pPr>
+            <w:r>
+              <w:rPr>
+                <w:b/>
+                <w:color w:val="1F3A8A"/>
+                <w:sz w:val="36"/>
+              </w:rPr>
+              <w:t>100</w:t>
+            </w:r>
+          </w:p>
+        </w:tc>
+        <w:tc>
+          <w:tcPr>
+            <w:tcW w:type="dxa" w:w="2268"/>
+            <w:shd w:val="clear" w:color="auto" w:fill="FFFFFF"/>
+            <w:tcBorders>
+              <w:top w:val="single" w:sz="4" w:color="E2E8F0"/>
+              <w:left w:val="single" w:sz="4" w:color="E2E8F0"/>
+              <w:bottom w:val="single" w:sz="4" w:color="E2E8F0"/>
+              <w:right w:val="single" w:sz="4" w:color="E2E8F0"/>
+            </w:tcBorders>
+          </w:tcPr>
+          <w:p>
+            <w:pPr>
+              <w:spacing w:before="120" w:after="120"/>
+              <w:jc w:val="center"/>
+            </w:pPr>
+            <w:r>
+              <w:rPr>
+                <w:b/>
+                <w:color w:val="1F3A8A"/>
+                <w:sz w:val="36"/>
+              </w:rPr>
+              <w:t>500</w:t>
+            </w:r>
+          </w:p>
+        </w:tc>
+        <w:tc>
+          <w:tcPr>
+            <w:tcW w:type="dxa" w:w="2268"/>
+            <w:shd w:val="clear" w:color="auto" w:fill="FFFFFF"/>
+            <w:tcBorders>
+              <w:top w:val="single" w:sz="4" w:color="E2E8F0"/>
+              <w:left w:val="single" w:sz="4" w:color="E2E8F0"/>
+              <w:bottom w:val="single" w:sz="4" w:color="E2E8F0"/>
+              <w:right w:val="single" w:sz="4" w:color="E2E8F0"/>
+            </w:tcBorders>
+          </w:tcPr>
+          <w:p>
+            <w:pPr>
+              <w:spacing w:before="120" w:after="120"/>
+              <w:jc w:val="center"/>
+            </w:pPr>
+            <w:r>
+              <w:rPr>
+                <w:b/>
+                <w:color w:val="1F3A8A"/>
+                <w:sz w:val="36"/>
+              </w:rPr>
+              <w:t>100</w:t>
+            </w:r>
+          </w:p>
+        </w:tc>
+        <w:tc>
+          <w:tcPr>
+            <w:tcW w:type="dxa" w:w="2268"/>
+            <w:shd w:val="clear" w:color="auto" w:fill="FFFFFF"/>
+            <w:tcBorders>
+              <w:top w:val="single" w:sz="4" w:color="E2E8F0"/>
+              <w:left w:val="single" w:sz="4" w:color="E2E8F0"/>
+              <w:bottom w:val="single" w:sz="4" w:color="E2E8F0"/>
+              <w:right w:val="single" w:sz="4" w:color="E2E8F0"/>
+            </w:tcBorders>
+          </w:tcPr>
+          <w:p>
+            <w:pPr>
+              <w:spacing w:before="120" w:after="120"/>
+              <w:jc w:val="center"/>
+            </w:pPr>
+            <w:r>
+              <w:rPr>
+                <w:b/>
+                <w:color w:val="1F3A8A"/>
+                <w:sz w:val="36"/>
+              </w:rPr>
+              <w:t>5</w:t>
+            </w:r>
+          </w:p>
+        </w:tc>
+      </w:tr>
+    </w:tbl>
+    <w:p>
+      <w:pPr>
+        <w:spacing w:after="40"/>
+      </w:pPr>
+    </w:p>
+    <w:tbl>
+      <w:tblPr>
+        <w:tblW w:type="auto" w:w="0"/>
+        <w:tblLayout w:type="autofit"/>
+        <w:tblLook w:firstColumn="1" w:firstRow="1" w:lastColumn="0" w:lastRow="0" w:noHBand="0" w:noVBand="1" w:val="04A0"/>
+      </w:tblPr>
+      <w:tblGrid>
+        <w:gridCol w:w="9518"/>
+      </w:tblGrid>
+      <w:tr>
+        <w:tc>
+          <w:tcPr>
+            <w:tcW w:type="dxa" w:w="9518"/>
+            <w:shd w:val="clear" w:color="auto" w:fill="D5F0DD"/>
+            <w:tcBorders>
+              <w:top w:val="single" w:sz="2" w:color="FFFFFF"/>
+              <w:left w:val="single" w:sz="24" w:color="2563EB"/>
+              <w:bottom w:val="single" w:sz="2" w:color="FFFFFF"/>
+              <w:right w:val="single" w:sz="2" w:color="FFFFFF"/>
+            </w:tcBorders>
+          </w:tcPr>
+          <w:p>
+            <w:pPr>
+              <w:spacing w:before="40" w:after="40" w:line="312" w:lineRule="auto"/>
+            </w:pPr>
+            <w:r>
+              <w:rPr>
+                <w:b/>
+                <w:color w:val="16A34A"/>
+                <w:sz w:val="21"/>
+              </w:rPr>
+              <w:t xml:space="preserve">Yorum: </w:t>
+            </w:r>
+            <w:r>
+              <w:rPr>
+                <w:color w:val="0F172A"/>
+                <w:sz w:val="21"/>
+              </w:rPr>
+              <w:t>100 boş, 500 dolu, doluların 100’ü kanban (doluya dahil), 5 hurdaya ayrılacak (boş/doluya dahil değil, ayrı sayılır).</w:t>
+            </w:r>
+          </w:p>
+        </w:tc>
+      </w:tr>
+    </w:tbl>
+    <w:p>
+      <w:pPr>
+        <w:spacing w:after="120"/>
+      </w:pPr>
+    </w:p>
+    <w:tbl>
+      <w:tblPr>
+        <w:tblW w:type="auto" w:w="0"/>
+        <w:tblLayout w:type="autofit"/>
+        <w:tblLook w:firstColumn="1" w:firstRow="1" w:lastColumn="0" w:lastRow="0" w:noHBand="0" w:noVBand="1" w:val="04A0"/>
+      </w:tblPr>
+      <w:tblGrid>
+        <w:gridCol w:w="9518"/>
+      </w:tblGrid>
+      <w:tr>
+        <w:tc>
+          <w:tcPr>
+            <w:tcW w:type="dxa" w:w="9518"/>
+            <w:shd w:val="clear" w:color="auto" w:fill="FCE4E4"/>
+            <w:tcBorders>
+              <w:top w:val="single" w:sz="2" w:color="FFFFFF"/>
+              <w:left w:val="single" w:sz="24" w:color="2563EB"/>
+              <w:bottom w:val="single" w:sz="2" w:color="FFFFFF"/>
+              <w:right w:val="single" w:sz="2" w:color="FFFFFF"/>
+            </w:tcBorders>
+          </w:tcPr>
+          <w:p>
+            <w:pPr>
+              <w:spacing w:before="40" w:after="40" w:line="312" w:lineRule="auto"/>
+            </w:pPr>
+            <w:r>
+              <w:rPr>
+                <w:b/>
+                <w:color w:val="DC2626"/>
+                <w:sz w:val="21"/>
+              </w:rPr>
+              <w:t xml:space="preserve">Önemli kural: </w:t>
+            </w:r>
+            <w:r>
+              <w:rPr>
+                <w:color w:val="0F172A"/>
+                <w:sz w:val="21"/>
+              </w:rPr>
+              <w:t>Kanban miktarı dolu miktarından büyük olamaz. Sistem buna izin vermez.</w:t>
+            </w:r>
+          </w:p>
+        </w:tc>
+      </w:tr>
+    </w:tbl>
+    <w:p>
+      <w:pPr>
+        <w:spacing w:after="120"/>
+      </w:pPr>
+    </w:p>
+    <w:p>
+      <w:pPr>
+        <w:pStyle w:val="Heading2"/>
+      </w:pPr>
+      <w:r>
+        <w:t>Kaydetme</w:t>
       </w:r>
     </w:p>
     <w:p>
       <w:pPr>
-        <w:spacing w:after="160"/>
-        <w:ind w:left="288"/>
-      </w:pPr>
-      <w:r>
-        <w:rPr>
-          <w:b/>
-          <w:color w:val="DC2626"/>
-          <w:sz w:val="22"/>
-        </w:rPr>
-        <w:t xml:space="preserve">  ▸  Zorunlu: </w:t>
-      </w:r>
-      <w:r>
-        <w:rPr>
-          <w:color w:val="0F172A"/>
-          <w:sz w:val="22"/>
-        </w:rPr>
-        <w:t>Bu alan boş bırakılırsa kaydedemezsiniz. Sistem uyarı verir, kutu kırmızıya döner.</w:t>
-      </w:r>
-    </w:p>
-    <w:p>
-      <w:pPr>
-        <w:spacing w:after="120"/>
+        <w:pStyle w:val="ListNumber"/>
+        <w:spacing w:after="60" w:line="312" w:lineRule="auto"/>
       </w:pPr>
       <w:r>
         <w:rPr>
           <w:color w:val="0F172A"/>
           <w:sz w:val="22"/>
         </w:rPr>
-        <w:t>O hafta için bölümünüzdeki yarı mamül tonajını yazın. Ondalık girebilirsiniz (örn. 1234 veya 12.5).</w:t>
-      </w:r>
-    </w:p>
-    <w:p>
-      <w:pPr>
-        <w:spacing w:before="280" w:after="120"/>
-      </w:pPr>
-      <w:r>
-        <w:rPr>
-          <w:b/>
-          <w:color w:val="2563EB"/>
-          <w:sz w:val="28"/>
-        </w:rPr>
-        <w:t>Renk × Sayım tablosu</w:t>
-      </w:r>
-    </w:p>
-    <w:p>
-      <w:pPr>
-        <w:spacing w:after="120"/>
-      </w:pPr>
-      <w:r>
-        <w:rPr>
-          <w:color w:val="0F172A"/>
-          <w:sz w:val="22"/>
-        </w:rPr>
-        <w:t>Her renk için 4 sayı girersiniz. Açıklamalar:</w:t>
-      </w:r>
-    </w:p>
-    <w:p>
-      <w:pPr>
-        <w:pStyle w:val="ListBullet"/>
-        <w:spacing w:after="60"/>
-        <w:ind w:left="720"/>
-      </w:pPr>
-      <w:r/>
-      <w:r>
-        <w:rPr>
-          <w:color w:val="0F172A"/>
-          <w:sz w:val="22"/>
-        </w:rPr>
-        <w:t>Boş — o renkten kaç adet boş konteyner var?</w:t>
-      </w:r>
-    </w:p>
-    <w:p>
-      <w:pPr>
-        <w:pStyle w:val="ListBullet"/>
-        <w:spacing w:after="60"/>
-        <w:ind w:left="720"/>
-      </w:pPr>
-      <w:r/>
-      <w:r>
-        <w:rPr>
-          <w:color w:val="0F172A"/>
-          <w:sz w:val="22"/>
-        </w:rPr>
-        <w:t>Dolu (toplam) — o renkten kaç adet dolu konteyner var?</w:t>
-      </w:r>
-    </w:p>
-    <w:p>
-      <w:pPr>
-        <w:pStyle w:val="ListBullet"/>
-        <w:spacing w:after="60"/>
-        <w:ind w:left="720"/>
-      </w:pPr>
-      <w:r/>
-      <w:r>
-        <w:rPr>
-          <w:color w:val="0F172A"/>
-          <w:sz w:val="22"/>
-        </w:rPr>
-        <w:t>Kanban — dolu konteynerlerin kaç tanesi kanban olarak kullanılıyor? (Kanban dolu’nun ALT KÜMESİ’dir; doludan büyük olamaz.)</w:t>
-      </w:r>
-    </w:p>
-    <w:p>
-      <w:pPr>
-        <w:pStyle w:val="ListBullet"/>
-        <w:spacing w:after="60"/>
-        <w:ind w:left="720"/>
-      </w:pPr>
-      <w:r/>
-      <w:r>
-        <w:rPr>
-          <w:color w:val="0F172A"/>
-          <w:sz w:val="22"/>
-        </w:rPr>
-        <w:t>Hurdaya Ayrılacak — artık kullanılmayacak konteynerler (ayağı kırık, çatlak vb.). Boş ve dolu sayılarına DAHİL DEĞİLDİR; ayrı sayılır.</w:t>
-      </w:r>
-    </w:p>
-    <w:p>
-      <w:pPr>
-        <w:spacing w:after="160"/>
-        <w:ind w:left="288"/>
-      </w:pPr>
-      <w:r>
-        <w:rPr>
-          <w:b/>
-          <w:color w:val="16A34A"/>
-          <w:sz w:val="22"/>
-        </w:rPr>
-        <w:t xml:space="preserve">  ▸  Örnek: </w:t>
-      </w:r>
-      <w:r>
-        <w:rPr>
-          <w:color w:val="0F172A"/>
-          <w:sz w:val="22"/>
-        </w:rPr>
-        <w:t>Mavi renkte: 100 boş, 500 dolu, doluların 100’ü kanban, 5 tane de hurdaya ayrılacak.</w:t>
-      </w:r>
-    </w:p>
-    <w:p>
-      <w:pPr>
-        <w:spacing w:after="160"/>
-        <w:ind w:left="288"/>
-      </w:pPr>
-      <w:r>
-        <w:rPr>
-          <w:b/>
-          <w:color w:val="DC2626"/>
-          <w:sz w:val="22"/>
-        </w:rPr>
-        <w:t xml:space="preserve">  ▸  Önemli kural: </w:t>
-      </w:r>
-      <w:r>
-        <w:rPr>
-          <w:color w:val="0F172A"/>
-          <w:sz w:val="22"/>
-        </w:rPr>
-        <w:t>Kanban miktarı, dolu miktarından büyük olamaz. Sistem buna izin vermez.</w:t>
-      </w:r>
-    </w:p>
-    <w:p>
-      <w:pPr>
-        <w:spacing w:before="280" w:after="120"/>
-      </w:pPr>
-      <w:r>
-        <w:rPr>
-          <w:b/>
-          <w:color w:val="2563EB"/>
-          <w:sz w:val="28"/>
-        </w:rPr>
-        <w:t>Kaydetme</w:t>
+        <w:t>Tüm değerleri girdikten sonra alttaki “Kaydet” butonuna basın.</w:t>
       </w:r>
     </w:p>
     <w:p>
       <w:pPr>
         <w:pStyle w:val="ListNumber"/>
-        <w:spacing w:after="60"/>
-      </w:pPr>
-      <w:r>
-        <w:rPr>
-          <w:color w:val="0F172A"/>
-          <w:sz w:val="22"/>
-        </w:rPr>
-        <w:t>Tüm değerleri girdikten sonra altta “Kaydet” butonuna basın.</w:t>
-      </w:r>
-    </w:p>
-    <w:p>
-      <w:pPr>
-        <w:pStyle w:val="ListNumber"/>
-        <w:spacing w:after="60"/>
+        <w:spacing w:after="60" w:line="312" w:lineRule="auto"/>
       </w:pPr>
       <w:r>
         <w:rPr>
@@ -643,36 +1329,32 @@
     </w:p>
     <w:p>
       <w:pPr>
-        <w:spacing w:before="280" w:after="120"/>
+        <w:pStyle w:val="Heading2"/>
       </w:pPr>
       <w:r>
-        <w:rPr>
-          <w:b/>
-          <w:color w:val="2563EB"/>
-          <w:sz w:val="28"/>
-        </w:rPr>
         <w:t>Yanlış girdiyseniz — Güncelleme</w:t>
       </w:r>
     </w:p>
     <w:p>
       <w:pPr>
-        <w:spacing w:after="120"/>
+        <w:spacing w:after="120" w:line="336" w:lineRule="auto"/>
+        <w:jc w:val="left"/>
       </w:pPr>
       <w:r>
         <w:rPr>
+          <w:b w:val="0"/>
+          <w:i w:val="0"/>
           <w:color w:val="0F172A"/>
           <w:sz w:val="22"/>
         </w:rPr>
-        <w:t>Aynı bölüm için aynı hafta içinde tekrar form açabilirsiniz:</w:t>
+        <w:t>Aynı bölüm için aynı hafta içinde formu tekrar açabilirsiniz:</w:t>
       </w:r>
     </w:p>
     <w:p>
       <w:pPr>
         <w:pStyle w:val="ListBullet"/>
-        <w:spacing w:after="60"/>
-        <w:ind w:left="720"/>
+        <w:spacing w:after="60" w:line="312" w:lineRule="auto"/>
       </w:pPr>
-      <w:r/>
       <w:r>
         <w:rPr>
           <w:color w:val="0F172A"/>
@@ -684,10 +1366,8 @@
     <w:p>
       <w:pPr>
         <w:pStyle w:val="ListBullet"/>
-        <w:spacing w:after="60"/>
-        <w:ind w:left="720"/>
+        <w:spacing w:after="60" w:line="312" w:lineRule="auto"/>
       </w:pPr>
-      <w:r/>
       <w:r>
         <w:rPr>
           <w:color w:val="0F172A"/>
@@ -699,10 +1379,8 @@
     <w:p>
       <w:pPr>
         <w:pStyle w:val="ListBullet"/>
-        <w:spacing w:after="60"/>
-        <w:ind w:left="720"/>
+        <w:spacing w:after="60" w:line="312" w:lineRule="auto"/>
       </w:pPr>
-      <w:r/>
       <w:r>
         <w:rPr>
           <w:color w:val="0F172A"/>
@@ -714,10 +1392,8 @@
     <w:p>
       <w:pPr>
         <w:pStyle w:val="ListBullet"/>
-        <w:spacing w:after="60"/>
-        <w:ind w:left="720"/>
+        <w:spacing w:after="60" w:line="312" w:lineRule="auto"/>
       </w:pPr>
-      <w:r/>
       <w:r>
         <w:rPr>
           <w:color w:val="0F172A"/>
@@ -726,73 +1402,119 @@
         <w:t>Sağ üstte “Sayım güncellendi” bildirimi görünür.</w:t>
       </w:r>
     </w:p>
+    <w:tbl>
+      <w:tblPr>
+        <w:tblW w:type="auto" w:w="0"/>
+        <w:tblLayout w:type="autofit"/>
+        <w:tblLook w:firstColumn="1" w:firstRow="1" w:lastColumn="0" w:lastRow="0" w:noHBand="0" w:noVBand="1" w:val="04A0"/>
+      </w:tblPr>
+      <w:tblGrid>
+        <w:gridCol w:w="9518"/>
+      </w:tblGrid>
+      <w:tr>
+        <w:tc>
+          <w:tcPr>
+            <w:tcW w:type="dxa" w:w="9518"/>
+            <w:shd w:val="clear" w:color="auto" w:fill="E0EAF8"/>
+            <w:tcBorders>
+              <w:top w:val="single" w:sz="2" w:color="FFFFFF"/>
+              <w:left w:val="single" w:sz="24" w:color="2563EB"/>
+              <w:bottom w:val="single" w:sz="2" w:color="FFFFFF"/>
+              <w:right w:val="single" w:sz="2" w:color="FFFFFF"/>
+            </w:tcBorders>
+          </w:tcPr>
+          <w:p>
+            <w:pPr>
+              <w:spacing w:before="40" w:after="40" w:line="312" w:lineRule="auto"/>
+            </w:pPr>
+            <w:r>
+              <w:rPr>
+                <w:b/>
+                <w:color w:val="2563EB"/>
+                <w:sz w:val="21"/>
+              </w:rPr>
+              <w:t xml:space="preserve">Hiç değişmediyse: </w:t>
+            </w:r>
+            <w:r>
+              <w:rPr>
+                <w:color w:val="0F172A"/>
+                <w:sz w:val="21"/>
+              </w:rPr>
+              <w:t>“Değişiklik yapılmadı” uyarısı gelir. Verileriniz olduğu gibi kalır, kayıp olmaz.</w:t>
+            </w:r>
+          </w:p>
+        </w:tc>
+      </w:tr>
+    </w:tbl>
+    <w:p>
+      <w:pPr>
+        <w:spacing w:after="120"/>
+      </w:pPr>
+    </w:p>
+    <w:tbl>
+      <w:tblPr>
+        <w:tblW w:type="auto" w:w="0"/>
+        <w:tblLook w:firstColumn="1" w:firstRow="1" w:lastColumn="0" w:lastRow="0" w:noHBand="0" w:noVBand="1" w:val="04A0"/>
+      </w:tblPr>
+      <w:tblGrid>
+        <w:gridCol w:w="9518"/>
+      </w:tblGrid>
+      <w:tr>
+        <w:tc>
+          <w:tcPr>
+            <w:tcW w:type="dxa" w:w="9518"/>
+            <w:tcBorders>
+              <w:top w:val="nil"/>
+              <w:left w:val="nil"/>
+              <w:right w:val="nil"/>
+              <w:bottom w:val="single" w:sz="6" w:color="CBD5E1"/>
+            </w:tcBorders>
+          </w:tcPr>
+          <w:p/>
+        </w:tc>
+      </w:tr>
+    </w:tbl>
     <w:p>
       <w:pPr>
         <w:spacing w:after="160"/>
-        <w:ind w:left="288"/>
+      </w:pPr>
+    </w:p>
+    <w:p>
+      <w:pPr>
+        <w:pStyle w:val="Heading1"/>
       </w:pPr>
       <w:r>
-        <w:rPr>
-          <w:b/>
-          <w:color w:val="475569"/>
-          <w:sz w:val="22"/>
-        </w:rPr>
-        <w:t xml:space="preserve">  ▸  Hiç değişiklik yapmadan tekrar bastığınızda: </w:t>
-      </w:r>
-      <w:r>
-        <w:rPr>
-          <w:color w:val="0F172A"/>
-          <w:sz w:val="22"/>
-        </w:rPr>
-        <w:t>“Değişiklik yapılmadı” uyarısı çıkar. Veriniz olduğu gibi kalır, herhangi bir kayıp olmaz.</w:t>
+        <w:t>4. Haftalık Durum</w:t>
       </w:r>
     </w:p>
     <w:p>
       <w:pPr>
-        <w:keepNext/>
-        <w:spacing w:before="400" w:after="160"/>
+        <w:spacing w:after="120" w:line="336" w:lineRule="auto"/>
+        <w:jc w:val="left"/>
       </w:pPr>
       <w:r>
         <w:rPr>
-          <w:b/>
-          <w:color w:val="1F3A8A"/>
-          <w:sz w:val="36"/>
+          <w:b w:val="0"/>
+          <w:i w:val="0"/>
+          <w:color w:val="0F172A"/>
+          <w:sz w:val="22"/>
         </w:rPr>
-        <w:t>4.  Haftalık Durum</w:t>
+        <w:t>Sol menüden “Haftalık Durum” sayfasına gidin. Bu sayfa, seçili haftanın tüm bölüm bilgilerini özetler.</w:t>
       </w:r>
     </w:p>
     <w:p>
       <w:pPr>
-        <w:spacing w:after="120"/>
+        <w:pStyle w:val="Heading2"/>
       </w:pPr>
       <w:r>
-        <w:rPr>
-          <w:color w:val="0F172A"/>
-          <w:sz w:val="22"/>
-        </w:rPr>
-        <w:t>Sol menüden “Haftalık Durum”a girin. Bu sayfa o haftanın tüm bölüm bilgilerini özetler.</w:t>
-      </w:r>
-    </w:p>
-    <w:p>
-      <w:pPr>
-        <w:spacing w:before="280" w:after="120"/>
-      </w:pPr>
-      <w:r>
-        <w:rPr>
-          <w:b/>
-          <w:color w:val="2563EB"/>
-          <w:sz w:val="28"/>
-        </w:rPr>
-        <w:t>Üstteki özet</w:t>
+        <w:t>Üst özet</w:t>
       </w:r>
     </w:p>
     <w:p>
       <w:pPr>
         <w:pStyle w:val="ListBullet"/>
-        <w:spacing w:after="60"/>
-        <w:ind w:left="720"/>
+        <w:spacing w:after="60" w:line="312" w:lineRule="auto"/>
       </w:pPr>
-      <w:r/>
       <w:r>
         <w:rPr>
           <w:color w:val="0F172A"/>
@@ -804,10 +1526,8 @@
     <w:p>
       <w:pPr>
         <w:pStyle w:val="ListBullet"/>
-        <w:spacing w:after="60"/>
-        <w:ind w:left="720"/>
+        <w:spacing w:after="60" w:line="312" w:lineRule="auto"/>
       </w:pPr>
-      <w:r/>
       <w:r>
         <w:rPr>
           <w:color w:val="0F172A"/>
@@ -818,169 +1538,291 @@
     </w:p>
     <w:p>
       <w:pPr>
-        <w:spacing w:before="280" w:after="120"/>
+        <w:pStyle w:val="Heading2"/>
       </w:pPr>
       <w:r>
-        <w:rPr>
-          <w:b/>
-          <w:color w:val="2563EB"/>
-          <w:sz w:val="28"/>
-        </w:rPr>
         <w:t>Bölüm × Renk Matrisi</w:t>
       </w:r>
     </w:p>
     <w:p>
       <w:pPr>
-        <w:spacing w:after="120"/>
+        <w:spacing w:after="120" w:line="336" w:lineRule="auto"/>
+        <w:jc w:val="left"/>
       </w:pPr>
       <w:r>
         <w:rPr>
+          <w:b w:val="0"/>
+          <w:i w:val="0"/>
           <w:color w:val="0F172A"/>
           <w:sz w:val="22"/>
         </w:rPr>
-        <w:t>Aşağıdaki tablo her bölüm için her rengin sayım değerlerini tek bakışta gösterir. Hücre formatı: Boş / Dolu / Kanban / Hurdaya Ayrılacak.</w:t>
+        <w:t>Her bölüm için her rengin sayım değerlerini tek bakışta gösterir. Hücre formatı: Boş / Dolu / Kanban / Hurdaya Ayrılacak.</w:t>
+      </w:r>
+    </w:p>
+    <w:tbl>
+      <w:tblPr>
+        <w:tblW w:type="auto" w:w="0"/>
+        <w:tblLayout w:type="autofit"/>
+        <w:tblLook w:firstColumn="1" w:firstRow="1" w:lastColumn="0" w:lastRow="0" w:noHBand="0" w:noVBand="1" w:val="04A0"/>
+      </w:tblPr>
+      <w:tblGrid>
+        <w:gridCol w:w="9518"/>
+      </w:tblGrid>
+      <w:tr>
+        <w:tc>
+          <w:tcPr>
+            <w:tcW w:type="dxa" w:w="9518"/>
+            <w:shd w:val="clear" w:color="auto" w:fill="E0EAF8"/>
+            <w:tcBorders>
+              <w:top w:val="single" w:sz="2" w:color="FFFFFF"/>
+              <w:left w:val="single" w:sz="24" w:color="2563EB"/>
+              <w:bottom w:val="single" w:sz="2" w:color="FFFFFF"/>
+              <w:right w:val="single" w:sz="2" w:color="FFFFFF"/>
+            </w:tcBorders>
+          </w:tcPr>
+          <w:p>
+            <w:pPr>
+              <w:spacing w:before="40" w:after="40" w:line="312" w:lineRule="auto"/>
+            </w:pPr>
+            <w:r>
+              <w:rPr>
+                <w:b/>
+                <w:color w:val="2563EB"/>
+                <w:sz w:val="21"/>
+              </w:rPr>
+              <w:t xml:space="preserve">Örnek hücre: </w:t>
+            </w:r>
+            <w:r>
+              <w:rPr>
+                <w:color w:val="0F172A"/>
+                <w:sz w:val="21"/>
+              </w:rPr>
+              <w:t>100/500/100/5 → 100 boş, 500 dolu, 100 kanban, 5 hurdaya ayrılacak.</w:t>
+            </w:r>
+          </w:p>
+        </w:tc>
+      </w:tr>
+    </w:tbl>
+    <w:p>
+      <w:pPr>
+        <w:spacing w:after="120"/>
+      </w:pPr>
+    </w:p>
+    <w:p>
+      <w:pPr>
+        <w:spacing w:after="120" w:line="336" w:lineRule="auto"/>
+        <w:jc w:val="left"/>
+      </w:pPr>
+      <w:r>
+        <w:rPr>
+          <w:b w:val="0"/>
+          <w:i w:val="0"/>
+          <w:color w:val="0F172A"/>
+          <w:sz w:val="22"/>
+        </w:rPr>
+        <w:t>En sağda Tonaj sütunu — bölümün o haftaki toplam tonajı.</w:t>
+      </w:r>
+    </w:p>
+    <w:tbl>
+      <w:tblPr>
+        <w:tblW w:type="auto" w:w="0"/>
+        <w:tblLook w:firstColumn="1" w:firstRow="1" w:lastColumn="0" w:lastRow="0" w:noHBand="0" w:noVBand="1" w:val="04A0"/>
+      </w:tblPr>
+      <w:tblGrid>
+        <w:gridCol w:w="9518"/>
+      </w:tblGrid>
+      <w:tr>
+        <w:tc>
+          <w:tcPr>
+            <w:tcW w:type="dxa" w:w="9518"/>
+            <w:tcBorders>
+              <w:top w:val="nil"/>
+              <w:left w:val="nil"/>
+              <w:right w:val="nil"/>
+              <w:bottom w:val="single" w:sz="6" w:color="CBD5E1"/>
+            </w:tcBorders>
+          </w:tcPr>
+          <w:p/>
+        </w:tc>
+      </w:tr>
+    </w:tbl>
+    <w:p>
+      <w:pPr>
+        <w:spacing w:after="160"/>
+      </w:pPr>
+    </w:p>
+    <w:p>
+      <w:pPr>
+        <w:pStyle w:val="Heading1"/>
+      </w:pPr>
+      <w:r>
+        <w:t>5. Yetkililer</w:t>
       </w:r>
     </w:p>
     <w:p>
       <w:pPr>
-        <w:spacing w:after="160"/>
-        <w:ind w:left="288"/>
+        <w:spacing w:after="120" w:line="336" w:lineRule="auto"/>
+        <w:jc w:val="left"/>
       </w:pPr>
       <w:r>
         <w:rPr>
-          <w:b/>
-          <w:color w:val="2563EB"/>
-          <w:sz w:val="22"/>
-        </w:rPr>
-        <w:t xml:space="preserve">  ▸  Örnek hücre: </w:t>
-      </w:r>
-      <w:r>
-        <w:rPr>
+          <w:b w:val="0"/>
+          <w:i w:val="0"/>
           <w:color w:val="0F172A"/>
           <w:sz w:val="22"/>
         </w:rPr>
-        <w:t>100/500/100/5 → 100 boş, 500 dolu, 100 kanban, 5 hurdaya ayrılacak.</w:t>
+        <w:t>Sol menüden “Yetkililer” sayfasına gidin. Hangi bölüme kimin yetkili olduğunu, her birinin sayım girip girmediğini gösterir. Kontrol amaçlıdır.</w:t>
+      </w:r>
+    </w:p>
+    <w:tbl>
+      <w:tblPr>
+        <w:tblW w:type="auto" w:w="0"/>
+        <w:tblLook w:firstColumn="1" w:firstRow="1" w:lastColumn="0" w:lastRow="0" w:noHBand="0" w:noVBand="1" w:val="04A0"/>
+      </w:tblPr>
+      <w:tblGrid>
+        <w:gridCol w:w="9518"/>
+      </w:tblGrid>
+      <w:tr>
+        <w:tc>
+          <w:tcPr>
+            <w:tcW w:type="dxa" w:w="9518"/>
+            <w:tcBorders>
+              <w:top w:val="nil"/>
+              <w:left w:val="nil"/>
+              <w:right w:val="nil"/>
+              <w:bottom w:val="single" w:sz="6" w:color="CBD5E1"/>
+            </w:tcBorders>
+          </w:tcPr>
+          <w:p/>
+        </w:tc>
+      </w:tr>
+    </w:tbl>
+    <w:p>
+      <w:pPr>
+        <w:spacing w:after="160"/>
+      </w:pPr>
+    </w:p>
+    <w:p>
+      <w:pPr>
+        <w:pStyle w:val="Heading1"/>
+      </w:pPr>
+      <w:r>
+        <w:t>6. Çıkış Yapma</w:t>
       </w:r>
     </w:p>
     <w:p>
       <w:pPr>
-        <w:spacing w:after="120"/>
+        <w:spacing w:after="120" w:line="336" w:lineRule="auto"/>
+        <w:jc w:val="left"/>
       </w:pPr>
       <w:r>
         <w:rPr>
+          <w:b w:val="0"/>
+          <w:i w:val="0"/>
           <w:color w:val="0F172A"/>
           <w:sz w:val="22"/>
         </w:rPr>
-        <w:t>En sağda Tonaj sütunu bulunur — bölümün o haftaki toplam tonajı.</w:t>
+        <w:t>Sol menünün altındaki “Çıkış Yap” butonuna basın. Login ekranına dönülür.</w:t>
+      </w:r>
+    </w:p>
+    <w:tbl>
+      <w:tblPr>
+        <w:tblW w:type="auto" w:w="0"/>
+        <w:tblLayout w:type="autofit"/>
+        <w:tblLook w:firstColumn="1" w:firstRow="1" w:lastColumn="0" w:lastRow="0" w:noHBand="0" w:noVBand="1" w:val="04A0"/>
+      </w:tblPr>
+      <w:tblGrid>
+        <w:gridCol w:w="9518"/>
+      </w:tblGrid>
+      <w:tr>
+        <w:tc>
+          <w:tcPr>
+            <w:tcW w:type="dxa" w:w="9518"/>
+            <w:shd w:val="clear" w:color="auto" w:fill="FFF3CD"/>
+            <w:tcBorders>
+              <w:top w:val="single" w:sz="2" w:color="FFFFFF"/>
+              <w:left w:val="single" w:sz="24" w:color="2563EB"/>
+              <w:bottom w:val="single" w:sz="2" w:color="FFFFFF"/>
+              <w:right w:val="single" w:sz="2" w:color="FFFFFF"/>
+            </w:tcBorders>
+          </w:tcPr>
+          <w:p>
+            <w:pPr>
+              <w:spacing w:before="40" w:after="40" w:line="312" w:lineRule="auto"/>
+            </w:pPr>
+            <w:r>
+              <w:rPr>
+                <w:b/>
+                <w:color w:val="CA8A04"/>
+                <w:sz w:val="21"/>
+              </w:rPr>
+              <w:t xml:space="preserve">Güvenlik: </w:t>
+            </w:r>
+            <w:r>
+              <w:rPr>
+                <w:color w:val="0F172A"/>
+                <w:sz w:val="21"/>
+              </w:rPr>
+              <w:t>Bilgisayardan kalkıyorsanız mutlaka çıkış yapın. Aksi halde başka biri sizin oturumunuzla işlem yapabilir.</w:t>
+            </w:r>
+          </w:p>
+        </w:tc>
+      </w:tr>
+    </w:tbl>
+    <w:p>
+      <w:pPr>
+        <w:spacing w:after="120"/>
+      </w:pPr>
+    </w:p>
+    <w:tbl>
+      <w:tblPr>
+        <w:tblW w:type="auto" w:w="0"/>
+        <w:tblLook w:firstColumn="1" w:firstRow="1" w:lastColumn="0" w:lastRow="0" w:noHBand="0" w:noVBand="1" w:val="04A0"/>
+      </w:tblPr>
+      <w:tblGrid>
+        <w:gridCol w:w="9518"/>
+      </w:tblGrid>
+      <w:tr>
+        <w:tc>
+          <w:tcPr>
+            <w:tcW w:type="dxa" w:w="9518"/>
+            <w:tcBorders>
+              <w:top w:val="nil"/>
+              <w:left w:val="nil"/>
+              <w:right w:val="nil"/>
+              <w:bottom w:val="single" w:sz="6" w:color="CBD5E1"/>
+            </w:tcBorders>
+          </w:tcPr>
+          <w:p/>
+        </w:tc>
+      </w:tr>
+    </w:tbl>
+    <w:p>
+      <w:pPr>
+        <w:spacing w:after="160"/>
+      </w:pPr>
+    </w:p>
+    <w:p>
+      <w:pPr>
+        <w:pStyle w:val="Heading1"/>
+      </w:pPr>
+      <w:r>
+        <w:t>7. Sık Karşılaşılan Sorunlar</w:t>
       </w:r>
     </w:p>
     <w:p>
       <w:pPr>
-        <w:keepNext/>
-        <w:spacing w:before="400" w:after="160"/>
+        <w:pStyle w:val="Heading3"/>
       </w:pPr>
       <w:r>
-        <w:rPr>
-          <w:b/>
-          <w:color w:val="1F3A8A"/>
-          <w:sz w:val="36"/>
-        </w:rPr>
-        <w:t>5.  Yetkililer</w:t>
-      </w:r>
-    </w:p>
-    <w:p>
-      <w:pPr>
-        <w:spacing w:after="120"/>
-      </w:pPr>
-      <w:r>
-        <w:rPr>
-          <w:color w:val="0F172A"/>
-          <w:sz w:val="22"/>
-        </w:rPr>
-        <w:t>Sol menüden “Yetkililer” sayfasına ulaşılır. Hangi bölüme kimin yetkili olduğunu, her birinin sayım girip girmediğini gösterir. Kontrol amaçlıdır.</w:t>
-      </w:r>
-    </w:p>
-    <w:p>
-      <w:pPr>
-        <w:keepNext/>
-        <w:spacing w:before="400" w:after="160"/>
-      </w:pPr>
-      <w:r>
-        <w:rPr>
-          <w:b/>
-          <w:color w:val="1F3A8A"/>
-          <w:sz w:val="36"/>
-        </w:rPr>
-        <w:t>6.  Çıkış Yapma</w:t>
-      </w:r>
-    </w:p>
-    <w:p>
-      <w:pPr>
-        <w:spacing w:after="120"/>
-      </w:pPr>
-      <w:r>
-        <w:rPr>
-          <w:color w:val="0F172A"/>
-          <w:sz w:val="22"/>
-        </w:rPr>
-        <w:t>Sol menünün en altındaki “Çıkış Yap” butonuna basın. Login ekranına döner.</w:t>
-      </w:r>
-    </w:p>
-    <w:p>
-      <w:pPr>
-        <w:spacing w:after="160"/>
-        <w:ind w:left="288"/>
-      </w:pPr>
-      <w:r>
-        <w:rPr>
-          <w:b/>
-          <w:color w:val="DC2626"/>
-          <w:sz w:val="22"/>
-        </w:rPr>
-        <w:t xml:space="preserve">  ▸  Bilgisayardan kalkıyorsanız: </w:t>
-      </w:r>
-      <w:r>
-        <w:rPr>
-          <w:color w:val="0F172A"/>
-          <w:sz w:val="22"/>
-        </w:rPr>
-        <w:t>Mutlaka çıkış yapın. Aksi halde başka biri sizin oturumunuzla işlem yapabilir.</w:t>
-      </w:r>
-    </w:p>
-    <w:p>
-      <w:pPr>
-        <w:keepNext/>
-        <w:spacing w:before="400" w:after="160"/>
-      </w:pPr>
-      <w:r>
-        <w:rPr>
-          <w:b/>
-          <w:color w:val="1F3A8A"/>
-          <w:sz w:val="36"/>
-        </w:rPr>
-        <w:t>7.  Sık Karşılaşılan Sorunlar</w:t>
-      </w:r>
-    </w:p>
-    <w:p>
-      <w:pPr>
-        <w:spacing w:before="280" w:after="120"/>
-      </w:pPr>
-      <w:r>
-        <w:rPr>
-          <w:b/>
-          <w:color w:val="2563EB"/>
-          <w:sz w:val="28"/>
-        </w:rPr>
         <w:t>“Sayım Girişi yapamıyorum, form pasif.”</w:t>
       </w:r>
     </w:p>
     <w:p>
       <w:pPr>
         <w:pStyle w:val="ListBullet"/>
-        <w:spacing w:after="60"/>
-        <w:ind w:left="720"/>
+        <w:spacing w:after="60" w:line="312" w:lineRule="auto"/>
       </w:pPr>
-      <w:r/>
       <w:r>
         <w:rPr>
           <w:color w:val="0F172A"/>
@@ -992,112 +1834,102 @@
     <w:p>
       <w:pPr>
         <w:pStyle w:val="ListBullet"/>
-        <w:spacing w:after="60"/>
-        <w:ind w:left="720"/>
-      </w:pPr>
-      <w:r/>
-      <w:r>
-        <w:rPr>
-          <w:color w:val="0F172A"/>
-          <w:sz w:val="22"/>
-        </w:rPr>
-        <w:t>Bölüm yetkisi atanmamış — “Yetkili bölüm bulunamadı” uyarısı görüyorsanız, yöneticinizle iletişime geçin.</w:t>
-      </w:r>
-    </w:p>
-    <w:p>
-      <w:pPr>
-        <w:spacing w:before="280" w:after="120"/>
-      </w:pPr>
-      <w:r>
-        <w:rPr>
-          <w:b/>
-          <w:color w:val="2563EB"/>
-          <w:sz w:val="28"/>
-        </w:rPr>
-        <w:t>“Şifremi unuttum.”</w:t>
-      </w:r>
-    </w:p>
-    <w:p>
-      <w:pPr>
-        <w:spacing w:after="120"/>
+        <w:spacing w:after="60" w:line="312" w:lineRule="auto"/>
       </w:pPr>
       <w:r>
         <w:rPr>
           <w:color w:val="0F172A"/>
           <w:sz w:val="22"/>
         </w:rPr>
-        <w:t>Yöneticinize haber verin. Şifrenizi sıfırlayıp size yeni şifrenizi iletecektir.</w:t>
+        <w:t>Bölüm yetkisi atanmamış — “Yetkili bölüm bulunamadı” uyarısı görüyorsanız yöneticinizle iletişime geçin.</w:t>
       </w:r>
     </w:p>
     <w:p>
       <w:pPr>
-        <w:spacing w:before="280" w:after="120"/>
+        <w:pStyle w:val="Heading3"/>
+      </w:pPr>
+      <w:r>
+        <w:t>“Şifremi unuttum.”</w:t>
+      </w:r>
+    </w:p>
+    <w:p>
+      <w:pPr>
+        <w:spacing w:after="120" w:line="336" w:lineRule="auto"/>
+        <w:jc w:val="left"/>
       </w:pPr>
       <w:r>
         <w:rPr>
-          <w:b/>
-          <w:color w:val="2563EB"/>
-          <w:sz w:val="28"/>
+          <w:b w:val="0"/>
+          <w:i w:val="0"/>
+          <w:color w:val="0F172A"/>
+          <w:sz w:val="22"/>
         </w:rPr>
+        <w:t>Yöneticinize haber verin. Şifrenizi sıfırlayıp size yenisini iletecektir.</w:t>
+      </w:r>
+    </w:p>
+    <w:p>
+      <w:pPr>
+        <w:pStyle w:val="Heading3"/>
+      </w:pPr>
+      <w:r>
         <w:t>“Yanlış değer girdim, düzeltebilir miyim?”</w:t>
       </w:r>
     </w:p>
     <w:p>
       <w:pPr>
-        <w:spacing w:after="120"/>
+        <w:spacing w:after="120" w:line="336" w:lineRule="auto"/>
+        <w:jc w:val="left"/>
       </w:pPr>
       <w:r>
         <w:rPr>
+          <w:b w:val="0"/>
+          <w:i w:val="0"/>
           <w:color w:val="0F172A"/>
           <w:sz w:val="22"/>
         </w:rPr>
-        <w:t>Pencere hâlâ açıksa: aynı bölüm + aynı hafta için Sayım Girişi sayfasını tekrar açıp değerleri düzeltin, “Güncelle”ye basın. Pencere kapandıysa yöneticinize bildirin; o gerektiğinde sizin için geç giriş açabilir.</w:t>
+        <w:t>Pencere hâlâ açıksa: aynı bölüm + aynı hafta için Sayım Girişi sayfasını tekrar açıp değerleri düzeltin, “Güncelle”ye basın. Pencere kapandıysa yöneticinize bildirin; gerektiğinde sizin için geç giriş açabilir.</w:t>
       </w:r>
     </w:p>
     <w:p>
       <w:pPr>
-        <w:spacing w:before="280" w:after="120"/>
+        <w:pStyle w:val="Heading3"/>
       </w:pPr>
       <w:r>
-        <w:rPr>
-          <w:b/>
-          <w:color w:val="2563EB"/>
-          <w:sz w:val="28"/>
-        </w:rPr>
         <w:t>“Saat geçti, sayımı giremedim.”</w:t>
       </w:r>
     </w:p>
     <w:p>
       <w:pPr>
-        <w:spacing w:after="120"/>
+        <w:spacing w:after="120" w:line="336" w:lineRule="auto"/>
+        <w:jc w:val="left"/>
       </w:pPr>
       <w:r>
         <w:rPr>
+          <w:b w:val="0"/>
+          <w:i w:val="0"/>
           <w:color w:val="0F172A"/>
           <w:sz w:val="22"/>
         </w:rPr>
-        <w:t>Yöneticinize haber verin. Yönetici geç giriş penceresi açabilir. Açıldığında siz ekranda “Sayım Açık” durumunu yine görür, normal şekilde sayım girersiniz.</w:t>
+        <w:t>Yöneticinize haber verin. Yönetici geç giriş penceresi açabilir. Açıldığında ekranınızda “Sayım Açık” durumu yine görünür ve normal şekilde sayım girersiniz.</w:t>
       </w:r>
     </w:p>
     <w:p>
       <w:pPr>
-        <w:spacing w:before="280" w:after="120"/>
+        <w:pStyle w:val="Heading3"/>
       </w:pPr>
       <w:r>
-        <w:rPr>
-          <w:b/>
-          <w:color w:val="2563EB"/>
-          <w:sz w:val="28"/>
-        </w:rPr>
         <w:t>“Kanban miktarını dolu’dan büyük yazınca uyarı veriyor.”</w:t>
       </w:r>
     </w:p>
     <w:p>
       <w:pPr>
-        <w:spacing w:after="120"/>
+        <w:spacing w:after="120" w:line="336" w:lineRule="auto"/>
+        <w:jc w:val="left"/>
       </w:pPr>
       <w:r>
         <w:rPr>
+          <w:b w:val="0"/>
+          <w:i w:val="0"/>
           <w:color w:val="0F172A"/>
           <w:sz w:val="22"/>
         </w:rPr>
@@ -1106,63 +1938,55 @@
     </w:p>
     <w:p>
       <w:pPr>
-        <w:spacing w:before="280" w:after="120"/>
+        <w:pStyle w:val="Heading3"/>
       </w:pPr>
       <w:r>
-        <w:rPr>
-          <w:b/>
-          <w:color w:val="2563EB"/>
-          <w:sz w:val="28"/>
-        </w:rPr>
-        <w:t>“Tonaj alanı kırmızı yanıp sönüyor.”</w:t>
+        <w:t>“Tonaj alanı kırmızı yanıyor.”</w:t>
       </w:r>
     </w:p>
     <w:p>
       <w:pPr>
-        <w:spacing w:after="120"/>
+        <w:spacing w:after="120" w:line="336" w:lineRule="auto"/>
+        <w:jc w:val="left"/>
       </w:pPr>
       <w:r>
         <w:rPr>
+          <w:b w:val="0"/>
+          <w:i w:val="0"/>
           <w:color w:val="0F172A"/>
           <w:sz w:val="22"/>
         </w:rPr>
         <w:t>Tonaj zorunlu alandır, boş bırakılamaz. Değer girip “Kaydet”e tekrar basın.</w:t>
       </w:r>
     </w:p>
-    <w:p>
-      <w:pPr>
-        <w:spacing w:after="240"/>
-        <w:jc w:val="center"/>
-      </w:pPr>
-      <w:r>
-        <w:rPr>
-          <w:color w:val="CBD5E1"/>
-          <w:sz w:val="16"/>
-        </w:rPr>
-        <w:t>──────────────────────────────────────────────────────────────────────</w:t>
-      </w:r>
-    </w:p>
-    <w:p>
-      <w:pPr>
-        <w:jc w:val="center"/>
-      </w:pPr>
-      <w:r>
-        <w:rPr>
-          <w:i/>
-          <w:color w:val="475569"/>
-          <w:sz w:val="18"/>
-        </w:rPr>
-        <w:t>Norm Fasteners — Konteyner Operasyon Merkezi</w:t>
-      </w:r>
-    </w:p>
     <w:sectPr>
+      <w:footerReference w:type="default" r:id="rId9"/>
       <w:pgSz w:w="12240" w:h="15840"/>
-      <w:pgMar w:top="1134" w:right="1247" w:bottom="1134" w:left="1247" w:header="720" w:footer="720" w:gutter="0"/>
+      <w:pgMar w:top="1247" w:right="1361" w:bottom="1247" w:left="1361" w:header="720" w:footer="720" w:gutter="0"/>
       <w:cols w:space="720"/>
       <w:docGrid w:linePitch="360"/>
     </w:sectPr>
   </w:body>
 </w:document>
+</file>
+
+<file path=word/footer1.xml><?xml version="1.0" encoding="utf-8"?>
+<w:ftr xmlns:m="http://schemas.openxmlformats.org/officeDocument/2006/math" xmlns:mc="http://schemas.openxmlformats.org/markup-compatibility/2006" xmlns:mo="http://schemas.microsoft.com/office/mac/office/2008/main" xmlns:mv="urn:schemas-microsoft-com:mac:vml" xmlns:o="urn:schemas-microsoft-com:office:office" xmlns:r="http://schemas.openxmlformats.org/officeDocument/2006/relationships" xmlns:v="urn:schemas-microsoft-com:vml" xmlns:w10="urn:schemas-microsoft-com:office:word" xmlns:w14="http://schemas.microsoft.com/office/word/2010/wordml" xmlns:w="http://schemas.openxmlformats.org/wordprocessingml/2006/main" xmlns:wne="http://schemas.microsoft.com/office/word/2006/wordml" xmlns:wp14="http://schemas.microsoft.com/office/word/2010/wordprocessingDrawing" xmlns:wp="http://schemas.openxmlformats.org/drawingml/2006/wordprocessingDrawing" xmlns:wpc="http://schemas.microsoft.com/office/word/2010/wordprocessingCanvas" xmlns:wpg="http://schemas.microsoft.com/office/word/2010/wordprocessingGroup" xmlns:wpi="http://schemas.microsoft.com/office/word/2010/wordprocessingInk" xmlns:wps="http://schemas.microsoft.com/office/word/2010/wordprocessingShape" mc:Ignorable="w14 wp14">
+  <w:p>
+    <w:pPr>
+      <w:pStyle w:val="Footer"/>
+      <w:jc w:val="center"/>
+    </w:pPr>
+    <w:r>
+      <w:rPr>
+        <w:i/>
+        <w:color w:val="94A3B8"/>
+        <w:sz w:val="18"/>
+      </w:rPr>
+      <w:t>Norm Fasteners — Konteyner Operasyon Merkezi</w:t>
+    </w:r>
+  </w:p>
+</w:ftr>
 </file>
 
 <file path=word/numbering.xml><?xml version="1.0" encoding="utf-8"?>
@@ -1528,6 +2352,9 @@
     <w:name w:val="Normal"/>
     <w:qFormat/>
     <w:rsid w:val="00FC693F"/>
+    <w:pPr>
+      <w:spacing w:line="336" w:lineRule="auto"/>
+    </w:pPr>
     <w:rPr>
       <w:rFonts w:ascii="Calibri" w:hAnsi="Calibri"/>
       <w:sz w:val="22"/>
@@ -1588,15 +2415,15 @@
     <w:pPr>
       <w:keepNext/>
       <w:keepLines/>
-      <w:spacing w:before="480" w:after="0"/>
+      <w:spacing w:before="480" w:after="160"/>
       <w:outlineLvl w:val="0"/>
     </w:pPr>
     <w:rPr>
-      <w:rFonts w:asciiTheme="majorHAnsi" w:eastAsiaTheme="majorEastAsia" w:hAnsiTheme="majorHAnsi" w:cstheme="majorBidi"/>
+      <w:rFonts w:asciiTheme="majorHAnsi" w:eastAsiaTheme="majorEastAsia" w:hAnsiTheme="majorHAnsi" w:cstheme="majorBidi" w:ascii="Calibri" w:hAnsi="Calibri"/>
       <w:b/>
       <w:bCs/>
-      <w:color w:val="365F91" w:themeColor="accent1" w:themeShade="BF"/>
-      <w:sz w:val="28"/>
+      <w:color w:val="1F3A8A"/>
+      <w:sz w:val="40"/>
       <w:szCs w:val="28"/>
     </w:rPr>
   </w:style>
@@ -1612,15 +2439,15 @@
     <w:pPr>
       <w:keepNext/>
       <w:keepLines/>
-      <w:spacing w:before="200" w:after="0"/>
+      <w:spacing w:before="280" w:after="80"/>
       <w:outlineLvl w:val="1"/>
     </w:pPr>
     <w:rPr>
-      <w:rFonts w:asciiTheme="majorHAnsi" w:eastAsiaTheme="majorEastAsia" w:hAnsiTheme="majorHAnsi" w:cstheme="majorBidi"/>
+      <w:rFonts w:asciiTheme="majorHAnsi" w:eastAsiaTheme="majorEastAsia" w:hAnsiTheme="majorHAnsi" w:cstheme="majorBidi" w:ascii="Calibri" w:hAnsi="Calibri"/>
       <w:b/>
       <w:bCs/>
-      <w:color w:val="4F81BD" w:themeColor="accent1"/>
-      <w:sz w:val="26"/>
+      <w:color w:val="2563EB"/>
+      <w:sz w:val="28"/>
       <w:szCs w:val="26"/>
     </w:rPr>
   </w:style>
@@ -1636,14 +2463,15 @@
     <w:pPr>
       <w:keepNext/>
       <w:keepLines/>
-      <w:spacing w:before="200" w:after="0"/>
+      <w:spacing w:before="160" w:after="40"/>
       <w:outlineLvl w:val="2"/>
     </w:pPr>
     <w:rPr>
-      <w:rFonts w:asciiTheme="majorHAnsi" w:eastAsiaTheme="majorEastAsia" w:hAnsiTheme="majorHAnsi" w:cstheme="majorBidi"/>
+      <w:rFonts w:asciiTheme="majorHAnsi" w:eastAsiaTheme="majorEastAsia" w:hAnsiTheme="majorHAnsi" w:cstheme="majorBidi" w:ascii="Calibri" w:hAnsi="Calibri"/>
       <w:b/>
       <w:bCs/>
-      <w:color w:val="4F81BD" w:themeColor="accent1"/>
+      <w:color w:val="0F172A"/>
+      <w:sz w:val="24"/>
     </w:rPr>
   </w:style>
   <w:style w:type="paragraph" w:styleId="Heading4">

</xml_diff>